<commit_message>
M2 - T3 : choose regression target, measure baselines and define domain limits
</commit_message>
<xml_diff>
--- a/docs/M2-dati/dati.docx
+++ b/docs/M2-dati/dati.docx
@@ -72,7 +72,7 @@
           <w:color w:val="5B6178"/>
           <w:sz w:val="20"/>
         </w:rPr>
-        <w:t xml:space="preserve"> · analisi esplorativa → sezioni </w:t>
+        <w:t xml:space="preserve"> · analisi esplorativa → </w:t>
       </w:r>
       <w:r>
         <w:rPr>
@@ -152,7 +152,7 @@
           <w:color w:val="5B6178"/>
           <w:sz w:val="20"/>
         </w:rPr>
-        <w:t xml:space="preserve">  </w:t>
+        <w:t xml:space="preserve"> </w:t>
       </w:r>
       <w:r>
         <w:rPr>
@@ -172,7 +172,7 @@
           <w:color w:val="5B6178"/>
           <w:sz w:val="20"/>
         </w:rPr>
-        <w:t xml:space="preserve"> · dizionario e pulizia → sezioni </w:t>
+        <w:t xml:space="preserve"> · dizionario e pulizia → </w:t>
       </w:r>
       <w:r>
         <w:rPr>
@@ -232,7 +232,7 @@
           <w:color w:val="5B6178"/>
           <w:sz w:val="20"/>
         </w:rPr>
-        <w:t xml:space="preserve">  </w:t>
+        <w:t xml:space="preserve"> </w:t>
       </w:r>
       <w:r>
         <w:rPr>
@@ -242,7 +242,7 @@
           <w:color w:val="5B6178"/>
           <w:sz w:val="20"/>
         </w:rPr>
-        <w:t>Procedimento completo:</w:t>
+        <w:t>Task M2-T3</w:t>
       </w:r>
       <w:r>
         <w:rPr>
@@ -252,6 +252,106 @@
           <w:color w:val="5B6178"/>
           <w:sz w:val="20"/>
         </w:rPr>
+        <w:t xml:space="preserve"> · target e limiti → </w:t>
+      </w:r>
+      <w:r>
+        <w:rPr>
+          <w:rFonts w:ascii="Calibri" w:hAnsi="Calibri"/>
+          <w:b w:val="0"/>
+          <w:i/>
+          <w:color w:val="5B6178"/>
+          <w:sz w:val="20"/>
+        </w:rPr>
+        <w:t>Il target</w:t>
+      </w:r>
+      <w:r>
+        <w:rPr>
+          <w:rFonts w:ascii="Calibri" w:hAnsi="Calibri"/>
+          <w:b w:val="0"/>
+          <w:i w:val="0"/>
+          <w:color w:val="5B6178"/>
+          <w:sz w:val="20"/>
+        </w:rPr>
+        <w:t xml:space="preserve">, </w:t>
+      </w:r>
+      <w:r>
+        <w:rPr>
+          <w:rFonts w:ascii="Calibri" w:hAnsi="Calibri"/>
+          <w:b w:val="0"/>
+          <w:i/>
+          <w:color w:val="5B6178"/>
+          <w:sz w:val="20"/>
+        </w:rPr>
+        <w:t>Modelli di riferimento</w:t>
+      </w:r>
+      <w:r>
+        <w:rPr>
+          <w:rFonts w:ascii="Calibri" w:hAnsi="Calibri"/>
+          <w:b w:val="0"/>
+          <w:i w:val="0"/>
+          <w:color w:val="5B6178"/>
+          <w:sz w:val="20"/>
+        </w:rPr>
+        <w:t xml:space="preserve">, </w:t>
+      </w:r>
+      <w:r>
+        <w:rPr>
+          <w:rFonts w:ascii="Calibri" w:hAnsi="Calibri"/>
+          <w:b w:val="0"/>
+          <w:i/>
+          <w:color w:val="5B6178"/>
+          <w:sz w:val="20"/>
+        </w:rPr>
+        <w:t>Limiti di trasferibilità</w:t>
+      </w:r>
+      <w:r>
+        <w:rPr>
+          <w:rFonts w:ascii="Calibri" w:hAnsi="Calibri"/>
+          <w:b w:val="0"/>
+          <w:i w:val="0"/>
+          <w:color w:val="5B6178"/>
+          <w:sz w:val="20"/>
+        </w:rPr>
+        <w:t xml:space="preserve">, </w:t>
+      </w:r>
+      <w:r>
+        <w:rPr>
+          <w:rFonts w:ascii="Calibri" w:hAnsi="Calibri"/>
+          <w:b w:val="0"/>
+          <w:i/>
+          <w:color w:val="5B6178"/>
+          <w:sz w:val="20"/>
+        </w:rPr>
+        <w:t>Cosa vedrà l'utente</w:t>
+      </w:r>
+      <w:r>
+        <w:rPr>
+          <w:rFonts w:ascii="Calibri" w:hAnsi="Calibri"/>
+          <w:b w:val="0"/>
+          <w:i w:val="0"/>
+          <w:color w:val="5B6178"/>
+          <w:sz w:val="20"/>
+        </w:rPr>
+        <w:t xml:space="preserve"> </w:t>
+      </w:r>
+      <w:r>
+        <w:rPr>
+          <w:rFonts w:ascii="Calibri" w:hAnsi="Calibri"/>
+          <w:b/>
+          <w:i w:val="0"/>
+          <w:color w:val="5B6178"/>
+          <w:sz w:val="20"/>
+        </w:rPr>
+        <w:t>Procedimento completo:</w:t>
+      </w:r>
+      <w:r>
+        <w:rPr>
+          <w:rFonts w:ascii="Calibri" w:hAnsi="Calibri"/>
+          <w:b w:val="0"/>
+          <w:i w:val="0"/>
+          <w:color w:val="5B6178"/>
+          <w:sz w:val="20"/>
+        </w:rPr>
         <w:t xml:space="preserve"> </w:t>
       </w:r>
       <w:r>
@@ -272,7 +372,7 @@
           <w:color w:val="5B6178"/>
           <w:sz w:val="20"/>
         </w:rPr>
-        <w:t xml:space="preserve"> (eseguibile dall'inizio alla fine)  </w:t>
+        <w:t xml:space="preserve"> (eseguibile dall'inizio alla fine) </w:t>
       </w:r>
       <w:r>
         <w:rPr>
@@ -312,27 +412,308 @@
           <w:color w:val="5B6178"/>
           <w:sz w:val="20"/>
         </w:rPr>
-        <w:t xml:space="preserve"> — 32 KB, ignorato da git  </w:t>
-      </w:r>
-      <w:r>
-        <w:rPr>
-          <w:rFonts w:ascii="Calibri" w:hAnsi="Calibri"/>
-          <w:b/>
-          <w:i w:val="0"/>
-          <w:color w:val="5B6178"/>
-          <w:sz w:val="20"/>
-        </w:rPr>
-        <w:t>Stato:</w:t>
-      </w:r>
-      <w:r>
-        <w:rPr>
-          <w:rFonts w:ascii="Calibri" w:hAnsi="Calibri"/>
-          <w:b w:val="0"/>
-          <w:i w:val="0"/>
-          <w:color w:val="5B6178"/>
-          <w:sz w:val="20"/>
-        </w:rPr>
-        <w:t xml:space="preserve"> manca la scelta motivata del target, che arriva con M2-T3.</w:t>
+        <w:t xml:space="preserve"> — 32 KB, ignorato da git</w:t>
+      </w:r>
+    </w:p>
+    <w:p>
+      <w:pPr>
+        <w:pStyle w:val="Heading2"/>
+      </w:pPr>
+      <w:r>
+        <w:rPr>
+          <w:rFonts w:ascii="Calibri" w:hAnsi="Calibri"/>
+          <w:b w:val="0"/>
+          <w:i w:val="0"/>
+          <w:color w:val="1A2138"/>
+          <w:sz w:val="26"/>
+        </w:rPr>
+        <w:t>Indice</w:t>
+      </w:r>
+    </w:p>
+    <w:p>
+      <w:pPr>
+        <w:pStyle w:val="ListNumber"/>
+        <w:spacing w:after="60"/>
+      </w:pPr>
+      <w:r>
+        <w:rPr>
+          <w:rFonts w:ascii="Calibri" w:hAnsi="Calibri"/>
+          <w:b w:val="0"/>
+          <w:i w:val="0"/>
+          <w:color w:val="1A2138"/>
+          <w:sz w:val="21"/>
+        </w:rPr>
+        <w:t>Fonte</w:t>
+      </w:r>
+      <w:r>
+        <w:rPr>
+          <w:rFonts w:ascii="Calibri" w:hAnsi="Calibri"/>
+          <w:b w:val="0"/>
+          <w:i w:val="0"/>
+          <w:color w:val="1A2138"/>
+          <w:sz w:val="21"/>
+        </w:rPr>
+        <w:t xml:space="preserve"> — da dove vengono i dati</w:t>
+      </w:r>
+    </w:p>
+    <w:p>
+      <w:pPr>
+        <w:pStyle w:val="ListNumber"/>
+        <w:spacing w:after="60"/>
+      </w:pPr>
+      <w:r>
+        <w:rPr>
+          <w:rFonts w:ascii="Calibri" w:hAnsi="Calibri"/>
+          <w:b w:val="0"/>
+          <w:i w:val="0"/>
+          <w:color w:val="1A2138"/>
+          <w:sz w:val="21"/>
+        </w:rPr>
+        <w:t>Struttura in breve</w:t>
+      </w:r>
+      <w:r>
+        <w:rPr>
+          <w:rFonts w:ascii="Calibri" w:hAnsi="Calibri"/>
+          <w:b w:val="0"/>
+          <w:i w:val="0"/>
+          <w:color w:val="1A2138"/>
+          <w:sz w:val="21"/>
+        </w:rPr>
+        <w:t xml:space="preserve"> — dimensioni e completezza</w:t>
+      </w:r>
+    </w:p>
+    <w:p>
+      <w:pPr>
+        <w:pStyle w:val="ListNumber"/>
+        <w:spacing w:after="60"/>
+      </w:pPr>
+      <w:r>
+        <w:rPr>
+          <w:rFonts w:ascii="Calibri" w:hAnsi="Calibri"/>
+          <w:b w:val="0"/>
+          <w:i w:val="0"/>
+          <w:color w:val="1A2138"/>
+          <w:sz w:val="21"/>
+        </w:rPr>
+        <w:t>Dizionario delle colonne</w:t>
+      </w:r>
+      <w:r>
+        <w:rPr>
+          <w:rFonts w:ascii="Calibri" w:hAnsi="Calibri"/>
+          <w:b w:val="0"/>
+          <w:i w:val="0"/>
+          <w:color w:val="1A2138"/>
+          <w:sz w:val="21"/>
+        </w:rPr>
+        <w:t xml:space="preserve"> — significato, tipi, range</w:t>
+      </w:r>
+    </w:p>
+    <w:p>
+      <w:pPr>
+        <w:pStyle w:val="ListNumber"/>
+        <w:spacing w:after="60"/>
+      </w:pPr>
+      <w:r>
+        <w:rPr>
+          <w:rFonts w:ascii="Calibri" w:hAnsi="Calibri"/>
+          <w:b w:val="0"/>
+          <w:i w:val="0"/>
+          <w:color w:val="1A2138"/>
+          <w:sz w:val="21"/>
+        </w:rPr>
+        <w:t>Osservazioni</w:t>
+      </w:r>
+      <w:r>
+        <w:rPr>
+          <w:rFonts w:ascii="Calibri" w:hAnsi="Calibri"/>
+          <w:b w:val="0"/>
+          <w:i w:val="0"/>
+          <w:color w:val="1A2138"/>
+          <w:sz w:val="21"/>
+        </w:rPr>
+        <w:t xml:space="preserve"> — cosa dicono i dati, in nove punti</w:t>
+      </w:r>
+    </w:p>
+    <w:p>
+      <w:pPr>
+        <w:pStyle w:val="ListNumber"/>
+        <w:spacing w:after="60"/>
+      </w:pPr>
+      <w:r>
+        <w:rPr>
+          <w:rFonts w:ascii="Calibri" w:hAnsi="Calibri"/>
+          <w:b w:val="0"/>
+          <w:i w:val="0"/>
+          <w:color w:val="1A2138"/>
+          <w:sz w:val="21"/>
+        </w:rPr>
+        <w:t>Anomalie e valori sospetti</w:t>
+      </w:r>
+      <w:r>
+        <w:rPr>
+          <w:rFonts w:ascii="Calibri" w:hAnsi="Calibri"/>
+          <w:b w:val="0"/>
+          <w:i w:val="0"/>
+          <w:color w:val="1A2138"/>
+          <w:sz w:val="21"/>
+        </w:rPr>
+        <w:t xml:space="preserve"> — cosa non torna</w:t>
+      </w:r>
+    </w:p>
+    <w:p>
+      <w:pPr>
+        <w:pStyle w:val="ListNumber"/>
+        <w:spacing w:after="60"/>
+      </w:pPr>
+      <w:r>
+        <w:rPr>
+          <w:rFonts w:ascii="Calibri" w:hAnsi="Calibri"/>
+          <w:b w:val="0"/>
+          <w:i w:val="0"/>
+          <w:color w:val="1A2138"/>
+          <w:sz w:val="21"/>
+        </w:rPr>
+        <w:t>Regole di pulizia</w:t>
+      </w:r>
+      <w:r>
+        <w:rPr>
+          <w:rFonts w:ascii="Calibri" w:hAnsi="Calibri"/>
+          <w:b w:val="0"/>
+          <w:i w:val="0"/>
+          <w:color w:val="1A2138"/>
+          <w:sz w:val="21"/>
+        </w:rPr>
+        <w:t xml:space="preserve"> — dodici decisioni motivate</w:t>
+      </w:r>
+    </w:p>
+    <w:p>
+      <w:pPr>
+        <w:pStyle w:val="ListNumber"/>
+        <w:spacing w:after="60"/>
+      </w:pPr>
+      <w:r>
+        <w:rPr>
+          <w:rFonts w:ascii="Calibri" w:hAnsi="Calibri"/>
+          <w:b w:val="0"/>
+          <w:i w:val="0"/>
+          <w:color w:val="1A2138"/>
+          <w:sz w:val="21"/>
+        </w:rPr>
+        <w:t>Conversioni di unità</w:t>
+      </w:r>
+      <w:r>
+        <w:rPr>
+          <w:rFonts w:ascii="Calibri" w:hAnsi="Calibri"/>
+          <w:b w:val="0"/>
+          <w:i w:val="0"/>
+          <w:color w:val="1A2138"/>
+          <w:sz w:val="21"/>
+        </w:rPr>
+        <w:t xml:space="preserve"> — libbre, chili, dollari</w:t>
+      </w:r>
+    </w:p>
+    <w:p>
+      <w:pPr>
+        <w:pStyle w:val="ListNumber"/>
+        <w:spacing w:after="60"/>
+      </w:pPr>
+      <w:r>
+        <w:rPr>
+          <w:rFonts w:ascii="Calibri" w:hAnsi="Calibri"/>
+          <w:b w:val="0"/>
+          <w:i w:val="0"/>
+          <w:color w:val="1A2138"/>
+          <w:sz w:val="21"/>
+        </w:rPr>
+        <w:t>Il target della regressione</w:t>
+      </w:r>
+      <w:r>
+        <w:rPr>
+          <w:rFonts w:ascii="Calibri" w:hAnsi="Calibri"/>
+          <w:b w:val="0"/>
+          <w:i w:val="0"/>
+          <w:color w:val="1A2138"/>
+          <w:sz w:val="21"/>
+        </w:rPr>
+        <w:t xml:space="preserve"> — cosa prevediamo</w:t>
+      </w:r>
+    </w:p>
+    <w:p>
+      <w:pPr>
+        <w:pStyle w:val="ListNumber"/>
+        <w:spacing w:after="60"/>
+      </w:pPr>
+      <w:r>
+        <w:rPr>
+          <w:rFonts w:ascii="Calibri" w:hAnsi="Calibri"/>
+          <w:b w:val="0"/>
+          <w:i w:val="0"/>
+          <w:color w:val="1A2138"/>
+          <w:sz w:val="21"/>
+        </w:rPr>
+        <w:t>Modelli di riferimento</w:t>
+      </w:r>
+      <w:r>
+        <w:rPr>
+          <w:rFonts w:ascii="Calibri" w:hAnsi="Calibri"/>
+          <w:b w:val="0"/>
+          <w:i w:val="0"/>
+          <w:color w:val="1A2138"/>
+          <w:sz w:val="21"/>
+        </w:rPr>
+        <w:t xml:space="preserve"> — la soglia da battere</w:t>
+      </w:r>
+    </w:p>
+    <w:p>
+      <w:pPr>
+        <w:pStyle w:val="ListNumber"/>
+        <w:spacing w:after="60"/>
+      </w:pPr>
+      <w:r>
+        <w:rPr>
+          <w:rFonts w:ascii="Calibri" w:hAnsi="Calibri"/>
+          <w:b w:val="0"/>
+          <w:i w:val="0"/>
+          <w:color w:val="1A2138"/>
+          <w:sz w:val="21"/>
+        </w:rPr>
+        <w:t>Limiti di trasferibilità</w:t>
+      </w:r>
+      <w:r>
+        <w:rPr>
+          <w:rFonts w:ascii="Calibri" w:hAnsi="Calibri"/>
+          <w:b w:val="0"/>
+          <w:i w:val="0"/>
+          <w:color w:val="1A2138"/>
+          <w:sz w:val="21"/>
+        </w:rPr>
+        <w:t xml:space="preserve"> — perché non è il tuo alveare</w:t>
+      </w:r>
+    </w:p>
+    <w:p>
+      <w:pPr>
+        <w:pStyle w:val="ListNumber"/>
+        <w:spacing w:after="60"/>
+      </w:pPr>
+      <w:r>
+        <w:rPr>
+          <w:rFonts w:ascii="Calibri" w:hAnsi="Calibri"/>
+          <w:b w:val="0"/>
+          <w:i w:val="0"/>
+          <w:color w:val="1A2138"/>
+          <w:sz w:val="21"/>
+        </w:rPr>
+        <w:t>Cosa vedrà l'utente</w:t>
+      </w:r>
+      <w:r>
+        <w:rPr>
+          <w:rFonts w:ascii="Calibri" w:hAnsi="Calibri"/>
+          <w:b w:val="0"/>
+          <w:i w:val="0"/>
+          <w:color w:val="1A2138"/>
+          <w:sz w:val="21"/>
+        </w:rPr>
+        <w:t xml:space="preserve"> — come si comunica una stima incerta</w:t>
       </w:r>
     </w:p>
     <w:p>
@@ -10551,7 +10932,2147 @@
           <w:color w:val="1A2138"/>
           <w:sz w:val="26"/>
         </w:rPr>
-        <w:t>Cosa comporta per il resto del progetto</w:t>
+        <w:t>Il target della regressione</w:t>
+      </w:r>
+    </w:p>
+    <w:p>
+      <w:pPr>
+        <w:jc w:val="both"/>
+      </w:pPr>
+      <w:r>
+        <w:rPr>
+          <w:rFonts w:ascii="Calibri" w:hAnsi="Calibri"/>
+          <w:b/>
+          <w:i w:val="0"/>
+          <w:color w:val="1A2138"/>
+          <w:sz w:val="21"/>
+        </w:rPr>
+        <w:t>Il modello prevede `resa_per_colonia_kg`: quanto miele produce in media una singola colonia in una stagione.</w:t>
+      </w:r>
+    </w:p>
+    <w:p>
+      <w:pPr>
+        <w:jc w:val="both"/>
+      </w:pPr>
+      <w:r>
+        <w:rPr>
+          <w:rFonts w:ascii="Calibri" w:hAnsi="Calibri"/>
+          <w:b w:val="0"/>
+          <w:i w:val="0"/>
+          <w:color w:val="1A2138"/>
+          <w:sz w:val="21"/>
+        </w:rPr>
+        <w:t>Il dataset offre sei grandezze numeriche. Quattro si escludono da sole:</w:t>
+      </w:r>
+    </w:p>
+    <w:p>
+      <w:pPr>
+        <w:jc w:val="both"/>
+      </w:pPr>
+      <w:r>
+        <w:rPr>
+          <w:rFonts w:ascii="Consolas" w:hAnsi="Consolas"/>
+          <w:b w:val="0"/>
+          <w:i w:val="0"/>
+          <w:color w:val="7A5200"/>
+          <w:sz w:val="20"/>
+        </w:rPr>
+        <w:t>totalprod</w:t>
+      </w:r>
+      <w:r>
+        <w:rPr>
+          <w:rFonts w:ascii="Calibri" w:hAnsi="Calibri"/>
+          <w:b w:val="0"/>
+          <w:i w:val="0"/>
+          <w:color w:val="1A2138"/>
+          <w:sz w:val="21"/>
+        </w:rPr>
+        <w:t xml:space="preserve"> e </w:t>
+      </w:r>
+      <w:r>
+        <w:rPr>
+          <w:rFonts w:ascii="Consolas" w:hAnsi="Consolas"/>
+          <w:b w:val="0"/>
+          <w:i w:val="0"/>
+          <w:color w:val="7A5200"/>
+          <w:sz w:val="20"/>
+        </w:rPr>
+        <w:t>prodvalue</w:t>
+      </w:r>
+      <w:r>
+        <w:rPr>
+          <w:rFonts w:ascii="Calibri" w:hAnsi="Calibri"/>
+          <w:b w:val="0"/>
+          <w:i w:val="0"/>
+          <w:color w:val="1A2138"/>
+          <w:sz w:val="21"/>
+        </w:rPr>
+        <w:t xml:space="preserve"> sono </w:t>
+      </w:r>
+      <w:r>
+        <w:rPr>
+          <w:rFonts w:ascii="Calibri" w:hAnsi="Calibri"/>
+          <w:b/>
+          <w:i w:val="0"/>
+          <w:color w:val="1A2138"/>
+          <w:sz w:val="21"/>
+        </w:rPr>
+        <w:t>calcolate</w:t>
+      </w:r>
+      <w:r>
+        <w:rPr>
+          <w:rFonts w:ascii="Calibri" w:hAnsi="Calibri"/>
+          <w:b w:val="0"/>
+          <w:i w:val="0"/>
+          <w:color w:val="1A2138"/>
+          <w:sz w:val="21"/>
+        </w:rPr>
+        <w:t xml:space="preserve"> dalle altre (osservazione 2). Prevederle significherebbe chiedere al modello di eseguire una moltiplicazione di cui gli abbiamo già dato i fattori: R² prossimo a 1 e nessuna conoscenza acquisita. È data leakage, e sarebbe la prima cosa che un esaminatore nota.</w:t>
+      </w:r>
+    </w:p>
+    <w:p>
+      <w:pPr>
+        <w:jc w:val="both"/>
+      </w:pPr>
+      <w:r>
+        <w:rPr>
+          <w:rFonts w:ascii="Consolas" w:hAnsi="Consolas"/>
+          <w:b w:val="0"/>
+          <w:i w:val="0"/>
+          <w:color w:val="7A5200"/>
+          <w:sz w:val="20"/>
+        </w:rPr>
+        <w:t>numcol</w:t>
+      </w:r>
+      <w:r>
+        <w:rPr>
+          <w:rFonts w:ascii="Calibri" w:hAnsi="Calibri"/>
+          <w:b w:val="0"/>
+          <w:i w:val="0"/>
+          <w:color w:val="1A2138"/>
+          <w:sz w:val="21"/>
+        </w:rPr>
+        <w:t xml:space="preserve"> è il numero di colonie: lo decide l'apicoltore, non le api. Non è una previsione, è un dato di ingresso.</w:t>
+      </w:r>
+    </w:p>
+    <w:p>
+      <w:pPr>
+        <w:jc w:val="both"/>
+      </w:pPr>
+      <w:r>
+        <w:rPr>
+          <w:rFonts w:ascii="Consolas" w:hAnsi="Consolas"/>
+          <w:b w:val="0"/>
+          <w:i w:val="0"/>
+          <w:color w:val="7A5200"/>
+          <w:sz w:val="20"/>
+        </w:rPr>
+        <w:t>stocks</w:t>
+      </w:r>
+      <w:r>
+        <w:rPr>
+          <w:rFonts w:ascii="Calibri" w:hAnsi="Calibri"/>
+          <w:b w:val="0"/>
+          <w:i w:val="0"/>
+          <w:color w:val="1A2138"/>
+          <w:sz w:val="21"/>
+        </w:rPr>
+        <w:t xml:space="preserve"> sono le scorte invendute e </w:t>
+      </w:r>
+      <w:r>
+        <w:rPr>
+          <w:rFonts w:ascii="Consolas" w:hAnsi="Consolas"/>
+          <w:b w:val="0"/>
+          <w:i w:val="0"/>
+          <w:color w:val="7A5200"/>
+          <w:sz w:val="20"/>
+        </w:rPr>
+        <w:t>priceperlb</w:t>
+      </w:r>
+      <w:r>
+        <w:rPr>
+          <w:rFonts w:ascii="Calibri" w:hAnsi="Calibri"/>
+          <w:b w:val="0"/>
+          <w:i w:val="0"/>
+          <w:color w:val="1A2138"/>
+          <w:sz w:val="21"/>
+        </w:rPr>
+        <w:t xml:space="preserve"> è il prezzo di mercato: dipendono da domanda, commercializzazione e politiche agricole, non dalla produttività dell'alveare. Prevederli richiederebbe dati economici che non abbiamo, e non risponderebbero alla domanda dell'utente.</w:t>
+      </w:r>
+    </w:p>
+    <w:p>
+      <w:pPr>
+        <w:jc w:val="both"/>
+      </w:pPr>
+      <w:r>
+        <w:rPr>
+          <w:rFonts w:ascii="Calibri" w:hAnsi="Calibri"/>
+          <w:b w:val="0"/>
+          <w:i w:val="0"/>
+          <w:color w:val="1A2138"/>
+          <w:sz w:val="21"/>
+        </w:rPr>
+        <w:t xml:space="preserve">Resta </w:t>
+      </w:r>
+      <w:r>
+        <w:rPr>
+          <w:rFonts w:ascii="Consolas" w:hAnsi="Consolas"/>
+          <w:b w:val="0"/>
+          <w:i w:val="0"/>
+          <w:color w:val="7A5200"/>
+          <w:sz w:val="20"/>
+        </w:rPr>
+        <w:t>yieldpercol</w:t>
+      </w:r>
+      <w:r>
+        <w:rPr>
+          <w:rFonts w:ascii="Calibri" w:hAnsi="Calibri"/>
+          <w:b w:val="0"/>
+          <w:i w:val="0"/>
+          <w:color w:val="1A2138"/>
+          <w:sz w:val="21"/>
+        </w:rPr>
+        <w:t>, ed è anche la scelta giusta nel merito, non solo per esclusione:</w:t>
+      </w:r>
+    </w:p>
+    <w:p>
+      <w:pPr>
+        <w:pStyle w:val="ListBullet"/>
+        <w:spacing w:after="60"/>
+      </w:pPr>
+      <w:r>
+        <w:rPr>
+          <w:rFonts w:ascii="Calibri" w:hAnsi="Calibri"/>
+          <w:b/>
+          <w:i w:val="0"/>
+          <w:color w:val="1A2138"/>
+          <w:sz w:val="21"/>
+        </w:rPr>
+        <w:t>È l'unica grandezza biologica.</w:t>
+      </w:r>
+      <w:r>
+        <w:rPr>
+          <w:rFonts w:ascii="Calibri" w:hAnsi="Calibri"/>
+          <w:b w:val="0"/>
+          <w:i w:val="0"/>
+          <w:color w:val="1A2138"/>
+          <w:sz w:val="21"/>
+        </w:rPr>
+        <w:t xml:space="preserve"> Dipende da clima, fioriture, salute della</w:t>
+      </w:r>
+    </w:p>
+    <w:p>
+      <w:pPr>
+        <w:jc w:val="both"/>
+      </w:pPr>
+      <w:r>
+        <w:rPr>
+          <w:rFonts w:ascii="Calibri" w:hAnsi="Calibri"/>
+          <w:b w:val="0"/>
+          <w:i w:val="0"/>
+          <w:color w:val="1A2138"/>
+          <w:sz w:val="21"/>
+        </w:rPr>
+        <w:t>colonia e gestione dell'apiario: esattamente i fattori su cui l'utente può intervenire.</w:t>
+      </w:r>
+    </w:p>
+    <w:p>
+      <w:pPr>
+        <w:pStyle w:val="ListBullet"/>
+        <w:spacing w:after="60"/>
+      </w:pPr>
+      <w:r>
+        <w:rPr>
+          <w:rFonts w:ascii="Calibri" w:hAnsi="Calibri"/>
+          <w:b/>
+          <w:i w:val="0"/>
+          <w:color w:val="1A2138"/>
+          <w:sz w:val="21"/>
+        </w:rPr>
+        <w:t>È indipendente dalla scala.</w:t>
+      </w:r>
+      <w:r>
+        <w:rPr>
+          <w:rFonts w:ascii="Calibri" w:hAnsi="Calibri"/>
+          <w:b w:val="0"/>
+          <w:i w:val="0"/>
+          <w:color w:val="1A2138"/>
+          <w:sz w:val="21"/>
+        </w:rPr>
+        <w:t xml:space="preserve"> Un apiario di tre alveari e uno stato con</w:t>
+      </w:r>
+    </w:p>
+    <w:p>
+      <w:pPr>
+        <w:jc w:val="both"/>
+      </w:pPr>
+      <w:r>
+        <w:rPr>
+          <w:rFonts w:ascii="Calibri" w:hAnsi="Calibri"/>
+          <w:b w:val="0"/>
+          <w:i w:val="0"/>
+          <w:color w:val="1A2138"/>
+          <w:sz w:val="21"/>
+        </w:rPr>
+        <w:t xml:space="preserve">500 000 colonie hanno rese confrontabili. </w:t>
+      </w:r>
+      <w:r>
+        <w:rPr>
+          <w:rFonts w:ascii="Consolas" w:hAnsi="Consolas"/>
+          <w:b w:val="0"/>
+          <w:i w:val="0"/>
+          <w:color w:val="7A5200"/>
+          <w:sz w:val="20"/>
+        </w:rPr>
+        <w:t>totalprod</w:t>
+      </w:r>
+      <w:r>
+        <w:rPr>
+          <w:rFonts w:ascii="Calibri" w:hAnsi="Calibri"/>
+          <w:b w:val="0"/>
+          <w:i w:val="0"/>
+          <w:color w:val="1A2138"/>
+          <w:sz w:val="21"/>
+        </w:rPr>
+        <w:t xml:space="preserve"> no: dipende da quanto è grande chi produce, quindi non sarebbe trasferibile a un amatore.</w:t>
+      </w:r>
+    </w:p>
+    <w:p>
+      <w:pPr>
+        <w:pStyle w:val="ListBullet"/>
+        <w:spacing w:after="60"/>
+      </w:pPr>
+      <w:r>
+        <w:rPr>
+          <w:rFonts w:ascii="Calibri" w:hAnsi="Calibri"/>
+          <w:b/>
+          <w:i w:val="0"/>
+          <w:color w:val="1A2138"/>
+          <w:sz w:val="21"/>
+        </w:rPr>
+        <w:t>Ha la distribuzione migliore.</w:t>
+      </w:r>
+      <w:r>
+        <w:rPr>
+          <w:rFonts w:ascii="Calibri" w:hAnsi="Calibri"/>
+          <w:b w:val="0"/>
+          <w:i w:val="0"/>
+          <w:color w:val="1A2138"/>
+          <w:sz w:val="21"/>
+        </w:rPr>
+        <w:t xml:space="preserve"> È l'unica variabile ragionevolmente</w:t>
+      </w:r>
+    </w:p>
+    <w:p>
+      <w:pPr>
+        <w:jc w:val="both"/>
+      </w:pPr>
+      <w:r>
+        <w:rPr>
+          <w:rFonts w:ascii="Calibri" w:hAnsi="Calibri"/>
+          <w:b w:val="0"/>
+          <w:i w:val="0"/>
+          <w:color w:val="1A2138"/>
+          <w:sz w:val="21"/>
+        </w:rPr>
+        <w:t>simmetrica e con la percentuale più bassa di outlier, 1,9 % (osservazione 7). Le altre sono asimmetriche a destra perché seguono la dimensione dello stato.</w:t>
+      </w:r>
+    </w:p>
+    <w:p>
+      <w:pPr>
+        <w:pStyle w:val="ListBullet"/>
+        <w:spacing w:after="60"/>
+      </w:pPr>
+      <w:r>
+        <w:rPr>
+          <w:rFonts w:ascii="Calibri" w:hAnsi="Calibri"/>
+          <w:b/>
+          <w:i w:val="0"/>
+          <w:color w:val="1A2138"/>
+          <w:sz w:val="21"/>
+        </w:rPr>
+        <w:t>È la domanda che l'utente si pone davvero</w:t>
+      </w:r>
+      <w:r>
+        <w:rPr>
+          <w:rFonts w:ascii="Calibri" w:hAnsi="Calibri"/>
+          <w:b w:val="0"/>
+          <w:i w:val="0"/>
+          <w:color w:val="1A2138"/>
+          <w:sz w:val="21"/>
+        </w:rPr>
+        <w:t>: *«quanto miele mi darà questo</w:t>
+      </w:r>
+    </w:p>
+    <w:p>
+      <w:pPr>
+        <w:jc w:val="both"/>
+      </w:pPr>
+      <w:r>
+        <w:rPr>
+          <w:rFonts w:ascii="Calibri" w:hAnsi="Calibri"/>
+          <w:b w:val="0"/>
+          <w:i w:val="0"/>
+          <w:color w:val="1A2138"/>
+          <w:sz w:val="21"/>
+        </w:rPr>
+        <w:t>alveare?»</w:t>
+      </w:r>
+      <w:r>
+        <w:rPr>
+          <w:rFonts w:ascii="Calibri" w:hAnsi="Calibri"/>
+          <w:b w:val="0"/>
+          <w:i/>
+          <w:color w:val="1A2138"/>
+          <w:sz w:val="21"/>
+        </w:rPr>
+        <w:t xml:space="preserve">, non </w:t>
+      </w:r>
+      <w:r>
+        <w:rPr>
+          <w:rFonts w:ascii="Calibri" w:hAnsi="Calibri"/>
+          <w:b w:val="0"/>
+          <w:i w:val="0"/>
+          <w:color w:val="1A2138"/>
+          <w:sz w:val="21"/>
+        </w:rPr>
+        <w:t>«quanto miele produrrà il Nord Dakota?»*.</w:t>
+      </w:r>
+    </w:p>
+    <w:p>
+      <w:pPr>
+        <w:pStyle w:val="Heading3"/>
+      </w:pPr>
+      <w:r>
+        <w:rPr>
+          <w:rFonts w:ascii="Calibri" w:hAnsi="Calibri"/>
+          <w:b w:val="0"/>
+          <w:i w:val="0"/>
+          <w:color w:val="A87200"/>
+          <w:sz w:val="23"/>
+        </w:rPr>
+        <w:t>Il target in cifre</w:t>
+      </w:r>
+    </w:p>
+    <w:tbl>
+      <w:tblPr>
+        <w:tblW w:type="auto" w:w="0"/>
+        <w:jc w:val="left"/>
+        <w:tblLayout w:type="fixed"/>
+        <w:tblLook w:firstColumn="1" w:firstRow="1" w:lastColumn="0" w:lastRow="0" w:noHBand="0" w:noVBand="1" w:val="04A0"/>
+        <w:tblBorders>
+          <w:top w:val="single" w:sz="4" w:space="0" w:color="D9D2C4"/>
+          <w:left w:val="single" w:sz="4" w:space="0" w:color="D9D2C4"/>
+          <w:bottom w:val="single" w:sz="4" w:space="0" w:color="D9D2C4"/>
+          <w:right w:val="single" w:sz="4" w:space="0" w:color="D9D2C4"/>
+          <w:insideH w:val="single" w:sz="4" w:space="0" w:color="D9D2C4"/>
+          <w:insideV w:val="single" w:sz="4" w:space="0" w:color="D9D2C4"/>
+        </w:tblBorders>
+      </w:tblPr>
+      <w:tblGrid>
+        <w:gridCol w:w="5291"/>
+        <w:gridCol w:w="3320"/>
+      </w:tblGrid>
+      <w:tr>
+        <w:tc>
+          <w:tcPr>
+            <w:tcW w:type="dxa" w:w="5291"/>
+            <w:shd w:val="clear" w:fill="F5EFE1"/>
+          </w:tcPr>
+          <w:p>
+            <w:pPr>
+              <w:spacing w:after="40"/>
+            </w:pPr>
+            <w:r>
+              <w:rPr>
+                <w:rFonts w:ascii="Calibri" w:hAnsi="Calibri"/>
+                <w:b/>
+                <w:color w:val="1A2138"/>
+                <w:sz w:val="19"/>
+              </w:rPr>
+            </w:r>
+          </w:p>
+        </w:tc>
+        <w:tc>
+          <w:tcPr>
+            <w:tcW w:type="dxa" w:w="3320"/>
+            <w:shd w:val="clear" w:fill="F5EFE1"/>
+          </w:tcPr>
+          <w:p>
+            <w:pPr>
+              <w:spacing w:after="40"/>
+            </w:pPr>
+            <w:r>
+              <w:rPr>
+                <w:rFonts w:ascii="Calibri" w:hAnsi="Calibri"/>
+                <w:b/>
+                <w:color w:val="1A2138"/>
+                <w:sz w:val="19"/>
+              </w:rPr>
+              <w:t>Valore</w:t>
+            </w:r>
+          </w:p>
+        </w:tc>
+      </w:tr>
+      <w:tr>
+        <w:tc>
+          <w:tcPr>
+            <w:tcW w:type="dxa" w:w="5291"/>
+          </w:tcPr>
+          <w:p>
+            <w:pPr>
+              <w:spacing w:after="40"/>
+            </w:pPr>
+            <w:r>
+              <w:rPr>
+                <w:rFonts w:ascii="Calibri" w:hAnsi="Calibri"/>
+                <w:b w:val="0"/>
+                <w:i w:val="0"/>
+                <w:color w:val="1A2138"/>
+                <w:sz w:val="19"/>
+              </w:rPr>
+              <w:t>Media</w:t>
+            </w:r>
+          </w:p>
+        </w:tc>
+        <w:tc>
+          <w:tcPr>
+            <w:tcW w:type="dxa" w:w="3320"/>
+          </w:tcPr>
+          <w:p>
+            <w:pPr>
+              <w:spacing w:after="40"/>
+            </w:pPr>
+            <w:r>
+              <w:rPr>
+                <w:rFonts w:ascii="Calibri" w:hAnsi="Calibri"/>
+                <w:b w:val="0"/>
+                <w:i w:val="0"/>
+                <w:color w:val="1A2138"/>
+                <w:sz w:val="19"/>
+              </w:rPr>
+              <w:t>28,13 kg per colonia</w:t>
+            </w:r>
+          </w:p>
+        </w:tc>
+      </w:tr>
+      <w:tr>
+        <w:tc>
+          <w:tcPr>
+            <w:tcW w:type="dxa" w:w="5291"/>
+          </w:tcPr>
+          <w:p>
+            <w:pPr>
+              <w:spacing w:after="40"/>
+            </w:pPr>
+            <w:r>
+              <w:rPr>
+                <w:rFonts w:ascii="Calibri" w:hAnsi="Calibri"/>
+                <w:b w:val="0"/>
+                <w:i w:val="0"/>
+                <w:color w:val="1A2138"/>
+                <w:sz w:val="19"/>
+              </w:rPr>
+              <w:t>Mediana</w:t>
+            </w:r>
+          </w:p>
+        </w:tc>
+        <w:tc>
+          <w:tcPr>
+            <w:tcW w:type="dxa" w:w="3320"/>
+          </w:tcPr>
+          <w:p>
+            <w:pPr>
+              <w:spacing w:after="40"/>
+            </w:pPr>
+            <w:r>
+              <w:rPr>
+                <w:rFonts w:ascii="Calibri" w:hAnsi="Calibri"/>
+                <w:b w:val="0"/>
+                <w:i w:val="0"/>
+                <w:color w:val="1A2138"/>
+                <w:sz w:val="19"/>
+              </w:rPr>
+              <w:t>27,22 kg</w:t>
+            </w:r>
+          </w:p>
+        </w:tc>
+      </w:tr>
+      <w:tr>
+        <w:tc>
+          <w:tcPr>
+            <w:tcW w:type="dxa" w:w="5291"/>
+          </w:tcPr>
+          <w:p>
+            <w:pPr>
+              <w:spacing w:after="40"/>
+            </w:pPr>
+            <w:r>
+              <w:rPr>
+                <w:rFonts w:ascii="Calibri" w:hAnsi="Calibri"/>
+                <w:b w:val="0"/>
+                <w:i w:val="0"/>
+                <w:color w:val="1A2138"/>
+                <w:sz w:val="19"/>
+              </w:rPr>
+              <w:t>Deviazione standard</w:t>
+            </w:r>
+          </w:p>
+        </w:tc>
+        <w:tc>
+          <w:tcPr>
+            <w:tcW w:type="dxa" w:w="3320"/>
+          </w:tcPr>
+          <w:p>
+            <w:pPr>
+              <w:spacing w:after="40"/>
+            </w:pPr>
+            <w:r>
+              <w:rPr>
+                <w:rFonts w:ascii="Calibri" w:hAnsi="Calibri"/>
+                <w:b w:val="0"/>
+                <w:i w:val="0"/>
+                <w:color w:val="1A2138"/>
+                <w:sz w:val="19"/>
+              </w:rPr>
+              <w:t>8,83 kg</w:t>
+            </w:r>
+          </w:p>
+        </w:tc>
+      </w:tr>
+      <w:tr>
+        <w:tc>
+          <w:tcPr>
+            <w:tcW w:type="dxa" w:w="5291"/>
+          </w:tcPr>
+          <w:p>
+            <w:pPr>
+              <w:spacing w:after="40"/>
+            </w:pPr>
+            <w:r>
+              <w:rPr>
+                <w:rFonts w:ascii="Calibri" w:hAnsi="Calibri"/>
+                <w:b w:val="0"/>
+                <w:i w:val="0"/>
+                <w:color w:val="1A2138"/>
+                <w:sz w:val="19"/>
+              </w:rPr>
+              <w:t>Scarto interquartile</w:t>
+            </w:r>
+          </w:p>
+        </w:tc>
+        <w:tc>
+          <w:tcPr>
+            <w:tcW w:type="dxa" w:w="3320"/>
+          </w:tcPr>
+          <w:p>
+            <w:pPr>
+              <w:spacing w:after="40"/>
+            </w:pPr>
+            <w:r>
+              <w:rPr>
+                <w:rFonts w:ascii="Calibri" w:hAnsi="Calibri"/>
+                <w:b w:val="0"/>
+                <w:i w:val="0"/>
+                <w:color w:val="1A2138"/>
+                <w:sz w:val="19"/>
+              </w:rPr>
+              <w:t>11,79 kg</w:t>
+            </w:r>
+          </w:p>
+        </w:tc>
+      </w:tr>
+      <w:tr>
+        <w:tc>
+          <w:tcPr>
+            <w:tcW w:type="dxa" w:w="5291"/>
+          </w:tcPr>
+          <w:p>
+            <w:pPr>
+              <w:spacing w:after="40"/>
+            </w:pPr>
+            <w:r>
+              <w:rPr>
+                <w:rFonts w:ascii="Calibri" w:hAnsi="Calibri"/>
+                <w:b w:val="0"/>
+                <w:i w:val="0"/>
+                <w:color w:val="1A2138"/>
+                <w:sz w:val="19"/>
+              </w:rPr>
+              <w:t>Minimo – massimo</w:t>
+            </w:r>
+          </w:p>
+        </w:tc>
+        <w:tc>
+          <w:tcPr>
+            <w:tcW w:type="dxa" w:w="3320"/>
+          </w:tcPr>
+          <w:p>
+            <w:pPr>
+              <w:spacing w:after="40"/>
+            </w:pPr>
+            <w:r>
+              <w:rPr>
+                <w:rFonts w:ascii="Calibri" w:hAnsi="Calibri"/>
+                <w:b w:val="0"/>
+                <w:i w:val="0"/>
+                <w:color w:val="1A2138"/>
+                <w:sz w:val="19"/>
+              </w:rPr>
+              <w:t>8,62 – 61,69 kg</w:t>
+            </w:r>
+          </w:p>
+        </w:tc>
+      </w:tr>
+      <w:tr>
+        <w:tc>
+          <w:tcPr>
+            <w:tcW w:type="dxa" w:w="5291"/>
+          </w:tcPr>
+          <w:p>
+            <w:pPr>
+              <w:spacing w:after="40"/>
+            </w:pPr>
+            <w:r>
+              <w:rPr>
+                <w:rFonts w:ascii="Calibri" w:hAnsi="Calibri"/>
+                <w:b w:val="0"/>
+                <w:i w:val="0"/>
+                <w:color w:val="1A2138"/>
+                <w:sz w:val="19"/>
+              </w:rPr>
+              <w:t>Intervallo che contiene l'80 % dei casi</w:t>
+            </w:r>
+          </w:p>
+        </w:tc>
+        <w:tc>
+          <w:tcPr>
+            <w:tcW w:type="dxa" w:w="3320"/>
+          </w:tcPr>
+          <w:p>
+            <w:pPr>
+              <w:spacing w:after="40"/>
+            </w:pPr>
+            <w:r>
+              <w:rPr>
+                <w:rFonts w:ascii="Calibri" w:hAnsi="Calibri"/>
+                <w:b w:val="0"/>
+                <w:i w:val="0"/>
+                <w:color w:val="1A2138"/>
+                <w:sz w:val="19"/>
+              </w:rPr>
+              <w:t>18,1 – 40,4 kg</w:t>
+            </w:r>
+          </w:p>
+        </w:tc>
+      </w:tr>
+    </w:tbl>
+    <w:p>
+      <w:pPr>
+        <w:spacing w:after="120"/>
+      </w:pPr>
+    </w:p>
+    <w:p>
+      <w:pPr>
+        <w:jc w:val="both"/>
+      </w:pPr>
+      <w:r>
+        <w:rPr>
+          <w:rFonts w:ascii="Calibri" w:hAnsi="Calibri"/>
+          <w:b w:val="0"/>
+          <w:i w:val="0"/>
+          <w:color w:val="1A2138"/>
+          <w:sz w:val="21"/>
+        </w:rPr>
+        <w:t xml:space="preserve">Quest'ultima riga è la più importante di tutta la sezione: </w:t>
+      </w:r>
+      <w:r>
+        <w:rPr>
+          <w:rFonts w:ascii="Calibri" w:hAnsi="Calibri"/>
+          <w:b/>
+          <w:i w:val="0"/>
+          <w:color w:val="1A2138"/>
+          <w:sz w:val="21"/>
+        </w:rPr>
+        <w:t>la resa varia da 18 a 40 kg anche restando nell'80 % centrale dei casi</w:t>
+      </w:r>
+      <w:r>
+        <w:rPr>
+          <w:rFonts w:ascii="Calibri" w:hAnsi="Calibri"/>
+          <w:b w:val="0"/>
+          <w:i w:val="0"/>
+          <w:color w:val="1A2138"/>
+          <w:sz w:val="21"/>
+        </w:rPr>
+        <w:t>. Qualunque previsione che si presenti come un numero singolo sta nascondendo questa dispersione.</w:t>
+      </w:r>
+    </w:p>
+    <w:p>
+      <w:pPr>
+        <w:spacing w:before="120" w:after="200"/>
+        <w:pBdr>
+          <w:bottom w:val="single" w:sz="6" w:space="6" w:color="D9D2C4"/>
+        </w:pBdr>
+      </w:pPr>
+    </w:p>
+    <w:p>
+      <w:pPr>
+        <w:pStyle w:val="Heading2"/>
+      </w:pPr>
+      <w:r>
+        <w:rPr>
+          <w:rFonts w:ascii="Calibri" w:hAnsi="Calibri"/>
+          <w:b w:val="0"/>
+          <w:i w:val="0"/>
+          <w:color w:val="1A2138"/>
+          <w:sz w:val="26"/>
+        </w:rPr>
+        <w:t>Modelli di riferimento</w:t>
+      </w:r>
+    </w:p>
+    <w:p>
+      <w:pPr>
+        <w:jc w:val="both"/>
+      </w:pPr>
+      <w:r>
+        <w:rPr>
+          <w:rFonts w:ascii="Calibri" w:hAnsi="Calibri"/>
+          <w:b w:val="0"/>
+          <w:i w:val="0"/>
+          <w:color w:val="1A2138"/>
+          <w:sz w:val="21"/>
+        </w:rPr>
+        <w:t>Prima di costruire un modello bisogna sapere quanto è difficile il problema. Due modelli banali danno la misura, e la soglia che M4 dovrà superare per giustificare la propria esistenza.</w:t>
+      </w:r>
+    </w:p>
+    <w:p>
+      <w:pPr>
+        <w:pStyle w:val="Heading3"/>
+      </w:pPr>
+      <w:r>
+        <w:rPr>
+          <w:rFonts w:ascii="Calibri" w:hAnsi="Calibri"/>
+          <w:b w:val="0"/>
+          <w:i w:val="0"/>
+          <w:color w:val="A87200"/>
+          <w:sz w:val="23"/>
+        </w:rPr>
+        <w:t>Sull'intero dataset</w:t>
+      </w:r>
+    </w:p>
+    <w:tbl>
+      <w:tblPr>
+        <w:tblW w:type="auto" w:w="0"/>
+        <w:jc w:val="left"/>
+        <w:tblLayout w:type="fixed"/>
+        <w:tblLook w:firstColumn="1" w:firstRow="1" w:lastColumn="0" w:lastRow="0" w:noHBand="0" w:noVBand="1" w:val="04A0"/>
+        <w:tblBorders>
+          <w:top w:val="single" w:sz="4" w:space="0" w:color="D9D2C4"/>
+          <w:left w:val="single" w:sz="4" w:space="0" w:color="D9D2C4"/>
+          <w:bottom w:val="single" w:sz="4" w:space="0" w:color="D9D2C4"/>
+          <w:right w:val="single" w:sz="4" w:space="0" w:color="D9D2C4"/>
+          <w:insideH w:val="single" w:sz="4" w:space="0" w:color="D9D2C4"/>
+          <w:insideV w:val="single" w:sz="4" w:space="0" w:color="D9D2C4"/>
+        </w:tblBorders>
+      </w:tblPr>
+      <w:tblGrid>
+        <w:gridCol w:w="2937"/>
+        <w:gridCol w:w="2066"/>
+        <w:gridCol w:w="1717"/>
+        <w:gridCol w:w="1892"/>
+      </w:tblGrid>
+      <w:tr>
+        <w:tc>
+          <w:tcPr>
+            <w:tcW w:type="dxa" w:w="2937"/>
+            <w:shd w:val="clear" w:fill="F5EFE1"/>
+          </w:tcPr>
+          <w:p>
+            <w:pPr>
+              <w:spacing w:after="40"/>
+            </w:pPr>
+            <w:r>
+              <w:rPr>
+                <w:rFonts w:ascii="Calibri" w:hAnsi="Calibri"/>
+                <w:b/>
+                <w:color w:val="1A2138"/>
+                <w:sz w:val="19"/>
+              </w:rPr>
+              <w:t>Modello di riferimento</w:t>
+            </w:r>
+          </w:p>
+        </w:tc>
+        <w:tc>
+          <w:tcPr>
+            <w:tcW w:type="dxa" w:w="2066"/>
+            <w:shd w:val="clear" w:fill="F5EFE1"/>
+          </w:tcPr>
+          <w:p>
+            <w:pPr>
+              <w:spacing w:after="40"/>
+            </w:pPr>
+            <w:r>
+              <w:rPr>
+                <w:rFonts w:ascii="Calibri" w:hAnsi="Calibri"/>
+                <w:b/>
+                <w:color w:val="1A2138"/>
+                <w:sz w:val="19"/>
+              </w:rPr>
+              <w:t>MAE</w:t>
+            </w:r>
+          </w:p>
+        </w:tc>
+        <w:tc>
+          <w:tcPr>
+            <w:tcW w:type="dxa" w:w="1717"/>
+            <w:shd w:val="clear" w:fill="F5EFE1"/>
+          </w:tcPr>
+          <w:p>
+            <w:pPr>
+              <w:spacing w:after="40"/>
+            </w:pPr>
+            <w:r>
+              <w:rPr>
+                <w:rFonts w:ascii="Calibri" w:hAnsi="Calibri"/>
+                <w:b/>
+                <w:color w:val="1A2138"/>
+                <w:sz w:val="19"/>
+              </w:rPr>
+              <w:t>RMSE</w:t>
+            </w:r>
+          </w:p>
+        </w:tc>
+        <w:tc>
+          <w:tcPr>
+            <w:tcW w:type="dxa" w:w="1892"/>
+            <w:shd w:val="clear" w:fill="F5EFE1"/>
+          </w:tcPr>
+          <w:p>
+            <w:pPr>
+              <w:spacing w:after="40"/>
+            </w:pPr>
+            <w:r>
+              <w:rPr>
+                <w:rFonts w:ascii="Calibri" w:hAnsi="Calibri"/>
+                <w:b/>
+                <w:color w:val="1A2138"/>
+                <w:sz w:val="19"/>
+              </w:rPr>
+              <w:t>R²</w:t>
+            </w:r>
+          </w:p>
+        </w:tc>
+      </w:tr>
+      <w:tr>
+        <w:tc>
+          <w:tcPr>
+            <w:tcW w:type="dxa" w:w="2937"/>
+          </w:tcPr>
+          <w:p>
+            <w:pPr>
+              <w:spacing w:after="40"/>
+            </w:pPr>
+            <w:r>
+              <w:rPr>
+                <w:rFonts w:ascii="Calibri" w:hAnsi="Calibri"/>
+                <w:b w:val="0"/>
+                <w:i w:val="0"/>
+                <w:color w:val="1A2138"/>
+                <w:sz w:val="19"/>
+              </w:rPr>
+              <w:t>Predice sempre la media globale</w:t>
+            </w:r>
+          </w:p>
+        </w:tc>
+        <w:tc>
+          <w:tcPr>
+            <w:tcW w:type="dxa" w:w="2066"/>
+          </w:tcPr>
+          <w:p>
+            <w:pPr>
+              <w:spacing w:after="40"/>
+            </w:pPr>
+            <w:r>
+              <w:rPr>
+                <w:rFonts w:ascii="Calibri" w:hAnsi="Calibri"/>
+                <w:b w:val="0"/>
+                <w:i w:val="0"/>
+                <w:color w:val="1A2138"/>
+                <w:sz w:val="19"/>
+              </w:rPr>
+              <w:t>6,98 kg</w:t>
+            </w:r>
+          </w:p>
+        </w:tc>
+        <w:tc>
+          <w:tcPr>
+            <w:tcW w:type="dxa" w:w="1717"/>
+          </w:tcPr>
+          <w:p>
+            <w:pPr>
+              <w:spacing w:after="40"/>
+            </w:pPr>
+            <w:r>
+              <w:rPr>
+                <w:rFonts w:ascii="Calibri" w:hAnsi="Calibri"/>
+                <w:b w:val="0"/>
+                <w:i w:val="0"/>
+                <w:color w:val="1A2138"/>
+                <w:sz w:val="19"/>
+              </w:rPr>
+              <w:t>8,82</w:t>
+            </w:r>
+          </w:p>
+        </w:tc>
+        <w:tc>
+          <w:tcPr>
+            <w:tcW w:type="dxa" w:w="1892"/>
+          </w:tcPr>
+          <w:p>
+            <w:pPr>
+              <w:spacing w:after="40"/>
+            </w:pPr>
+            <w:r>
+              <w:rPr>
+                <w:rFonts w:ascii="Calibri" w:hAnsi="Calibri"/>
+                <w:b w:val="0"/>
+                <w:i w:val="0"/>
+                <w:color w:val="1A2138"/>
+                <w:sz w:val="19"/>
+              </w:rPr>
+              <w:t>0,000</w:t>
+            </w:r>
+          </w:p>
+        </w:tc>
+      </w:tr>
+      <w:tr>
+        <w:tc>
+          <w:tcPr>
+            <w:tcW w:type="dxa" w:w="2937"/>
+          </w:tcPr>
+          <w:p>
+            <w:pPr>
+              <w:spacing w:after="40"/>
+            </w:pPr>
+            <w:r>
+              <w:rPr>
+                <w:rFonts w:ascii="Calibri" w:hAnsi="Calibri"/>
+                <w:b w:val="0"/>
+                <w:i w:val="0"/>
+                <w:color w:val="1A2138"/>
+                <w:sz w:val="19"/>
+              </w:rPr>
+              <w:t>Predice la media del suo stato</w:t>
+            </w:r>
+          </w:p>
+        </w:tc>
+        <w:tc>
+          <w:tcPr>
+            <w:tcW w:type="dxa" w:w="2066"/>
+          </w:tcPr>
+          <w:p>
+            <w:pPr>
+              <w:spacing w:after="40"/>
+            </w:pPr>
+            <w:r>
+              <w:rPr>
+                <w:rFonts w:ascii="Calibri" w:hAnsi="Calibri"/>
+                <w:b/>
+                <w:i w:val="0"/>
+                <w:color w:val="1A2138"/>
+                <w:sz w:val="19"/>
+              </w:rPr>
+              <w:t>4,15 kg</w:t>
+            </w:r>
+          </w:p>
+        </w:tc>
+        <w:tc>
+          <w:tcPr>
+            <w:tcW w:type="dxa" w:w="1717"/>
+          </w:tcPr>
+          <w:p>
+            <w:pPr>
+              <w:spacing w:after="40"/>
+            </w:pPr>
+            <w:r>
+              <w:rPr>
+                <w:rFonts w:ascii="Calibri" w:hAnsi="Calibri"/>
+                <w:b w:val="0"/>
+                <w:i w:val="0"/>
+                <w:color w:val="1A2138"/>
+                <w:sz w:val="19"/>
+              </w:rPr>
+              <w:t>5,35</w:t>
+            </w:r>
+          </w:p>
+        </w:tc>
+        <w:tc>
+          <w:tcPr>
+            <w:tcW w:type="dxa" w:w="1892"/>
+          </w:tcPr>
+          <w:p>
+            <w:pPr>
+              <w:spacing w:after="40"/>
+            </w:pPr>
+            <w:r>
+              <w:rPr>
+                <w:rFonts w:ascii="Calibri" w:hAnsi="Calibri"/>
+                <w:b w:val="0"/>
+                <w:i w:val="0"/>
+                <w:color w:val="1A2138"/>
+                <w:sz w:val="19"/>
+              </w:rPr>
+              <w:t>0,631</w:t>
+            </w:r>
+          </w:p>
+        </w:tc>
+      </w:tr>
+    </w:tbl>
+    <w:p>
+      <w:pPr>
+        <w:spacing w:after="120"/>
+      </w:pPr>
+    </w:p>
+    <w:p>
+      <w:pPr>
+        <w:jc w:val="both"/>
+      </w:pPr>
+      <w:r>
+        <w:rPr>
+          <w:rFonts w:ascii="Calibri" w:hAnsi="Calibri"/>
+          <w:b w:val="0"/>
+          <w:i w:val="0"/>
+          <w:color w:val="1A2138"/>
+          <w:sz w:val="21"/>
+        </w:rPr>
+        <w:t xml:space="preserve">Conoscere soltanto lo stato riduce l'errore del </w:t>
+      </w:r>
+      <w:r>
+        <w:rPr>
+          <w:rFonts w:ascii="Calibri" w:hAnsi="Calibri"/>
+          <w:b/>
+          <w:i w:val="0"/>
+          <w:color w:val="1A2138"/>
+          <w:sz w:val="21"/>
+        </w:rPr>
+        <w:t>41 %</w:t>
+      </w:r>
+      <w:r>
+        <w:rPr>
+          <w:rFonts w:ascii="Calibri" w:hAnsi="Calibri"/>
+          <w:b w:val="0"/>
+          <w:i w:val="0"/>
+          <w:color w:val="1A2138"/>
+          <w:sz w:val="21"/>
+        </w:rPr>
+        <w:t xml:space="preserve">. Non sorprende: la varianza fra stati è il 64 % della varianza totale (osservazione 8, Hawaii 98 lb contro Maine 31 lb). </w:t>
+      </w:r>
+      <w:r>
+        <w:rPr>
+          <w:rFonts w:ascii="Calibri" w:hAnsi="Calibri"/>
+          <w:b/>
+          <w:i w:val="0"/>
+          <w:color w:val="1A2138"/>
+          <w:sz w:val="21"/>
+        </w:rPr>
+        <w:t>La geografia è di gran lunga il fattore più importante</w:t>
+      </w:r>
+      <w:r>
+        <w:rPr>
+          <w:rFonts w:ascii="Calibri" w:hAnsi="Calibri"/>
+          <w:b w:val="0"/>
+          <w:i w:val="0"/>
+          <w:color w:val="1A2138"/>
+          <w:sz w:val="21"/>
+        </w:rPr>
+        <w:t>, e un modello che non la usa parte perdente.</w:t>
+      </w:r>
+    </w:p>
+    <w:p>
+      <w:pPr>
+        <w:spacing w:after="200"/>
+        <w:ind w:left="283"/>
+        <w:pBdr>
+          <w:left w:val="single" w:sz="12" w:space="6" w:color="A87200"/>
+        </w:pBdr>
+      </w:pPr>
+      <w:r>
+        <w:rPr>
+          <w:rFonts w:ascii="Calibri" w:hAnsi="Calibri"/>
+          <w:b/>
+          <w:i w:val="0"/>
+          <w:color w:val="5B6178"/>
+          <w:sz w:val="20"/>
+        </w:rPr>
+        <w:t>Una trappola da evitare.</w:t>
+      </w:r>
+      <w:r>
+        <w:rPr>
+          <w:rFonts w:ascii="Calibri" w:hAnsi="Calibri"/>
+          <w:b w:val="0"/>
+          <w:i w:val="0"/>
+          <w:color w:val="5B6178"/>
+          <w:sz w:val="20"/>
+        </w:rPr>
+        <w:t xml:space="preserve"> Un terzo "modello" che predice la media del gruppo (stato, anno) ottiene MAE 0,00 e R² 1,000. Non è un modello: (</w:t>
+      </w:r>
+      <w:r>
+        <w:rPr>
+          <w:rFonts w:ascii="Consolas" w:hAnsi="Consolas"/>
+          <w:b w:val="0"/>
+          <w:i w:val="0"/>
+          <w:color w:val="7A5200"/>
+          <w:sz w:val="19"/>
+        </w:rPr>
+        <w:t>stato</w:t>
+      </w:r>
+      <w:r>
+        <w:rPr>
+          <w:rFonts w:ascii="Calibri" w:hAnsi="Calibri"/>
+          <w:b w:val="0"/>
+          <w:i w:val="0"/>
+          <w:color w:val="5B6178"/>
+          <w:sz w:val="20"/>
+        </w:rPr>
+        <w:t xml:space="preserve">, </w:t>
+      </w:r>
+      <w:r>
+        <w:rPr>
+          <w:rFonts w:ascii="Consolas" w:hAnsi="Consolas"/>
+          <w:b w:val="0"/>
+          <w:i w:val="0"/>
+          <w:color w:val="7A5200"/>
+          <w:sz w:val="19"/>
+        </w:rPr>
+        <w:t>anno</w:t>
+      </w:r>
+      <w:r>
+        <w:rPr>
+          <w:rFonts w:ascii="Calibri" w:hAnsi="Calibri"/>
+          <w:b w:val="0"/>
+          <w:i w:val="0"/>
+          <w:color w:val="5B6178"/>
+          <w:sz w:val="20"/>
+        </w:rPr>
+        <w:t>) è la chiave primaria del dataset, quindi ogni gruppo contiene una riga sola e la "media" è il valore stesso. È la stessa forma di errore dell'osservazione 2, travestita da aggregazione. Se in M4 un modello restituisce R² sospettosamente vicino a 1, la prima cosa da cercare è questa.</w:t>
+      </w:r>
+    </w:p>
+    <w:p>
+      <w:pPr>
+        <w:pStyle w:val="Heading3"/>
+      </w:pPr>
+      <w:r>
+        <w:rPr>
+          <w:rFonts w:ascii="Calibri" w:hAnsi="Calibri"/>
+          <w:b w:val="0"/>
+          <w:i w:val="0"/>
+          <w:color w:val="A87200"/>
+          <w:sz w:val="23"/>
+        </w:rPr>
+        <w:t>Su dati mai visti</w:t>
+      </w:r>
+    </w:p>
+    <w:p>
+      <w:pPr>
+        <w:jc w:val="both"/>
+      </w:pPr>
+      <w:r>
+        <w:rPr>
+          <w:rFonts w:ascii="Calibri" w:hAnsi="Calibri"/>
+          <w:b w:val="0"/>
+          <w:i w:val="0"/>
+          <w:color w:val="1A2138"/>
+          <w:sz w:val="21"/>
+        </w:rPr>
+        <w:t>Il confronto onesto si fa addestrando sul passato e verificando sul futuro, perché i dati hanno una tendenza temporale. Addestramento 1998–2009 (506 righe), verifica 2010–2012 (120 righe):</w:t>
+      </w:r>
+    </w:p>
+    <w:tbl>
+      <w:tblPr>
+        <w:tblW w:type="auto" w:w="0"/>
+        <w:jc w:val="left"/>
+        <w:tblLayout w:type="fixed"/>
+        <w:tblLook w:firstColumn="1" w:firstRow="1" w:lastColumn="0" w:lastRow="0" w:noHBand="0" w:noVBand="1" w:val="04A0"/>
+        <w:tblBorders>
+          <w:top w:val="single" w:sz="4" w:space="0" w:color="D9D2C4"/>
+          <w:left w:val="single" w:sz="4" w:space="0" w:color="D9D2C4"/>
+          <w:bottom w:val="single" w:sz="4" w:space="0" w:color="D9D2C4"/>
+          <w:right w:val="single" w:sz="4" w:space="0" w:color="D9D2C4"/>
+          <w:insideH w:val="single" w:sz="4" w:space="0" w:color="D9D2C4"/>
+          <w:insideV w:val="single" w:sz="4" w:space="0" w:color="D9D2C4"/>
+        </w:tblBorders>
+      </w:tblPr>
+      <w:tblGrid>
+        <w:gridCol w:w="2324"/>
+        <w:gridCol w:w="1622"/>
+        <w:gridCol w:w="1422"/>
+        <w:gridCol w:w="1622"/>
+        <w:gridCol w:w="1622"/>
+      </w:tblGrid>
+      <w:tr>
+        <w:tc>
+          <w:tcPr>
+            <w:tcW w:type="dxa" w:w="2324"/>
+            <w:shd w:val="clear" w:fill="F5EFE1"/>
+          </w:tcPr>
+          <w:p>
+            <w:pPr>
+              <w:spacing w:after="40"/>
+            </w:pPr>
+            <w:r>
+              <w:rPr>
+                <w:rFonts w:ascii="Calibri" w:hAnsi="Calibri"/>
+                <w:b/>
+                <w:color w:val="1A2138"/>
+                <w:sz w:val="19"/>
+              </w:rPr>
+              <w:t>Modello di riferimento</w:t>
+            </w:r>
+          </w:p>
+        </w:tc>
+        <w:tc>
+          <w:tcPr>
+            <w:tcW w:type="dxa" w:w="1622"/>
+            <w:shd w:val="clear" w:fill="F5EFE1"/>
+          </w:tcPr>
+          <w:p>
+            <w:pPr>
+              <w:spacing w:after="40"/>
+            </w:pPr>
+            <w:r>
+              <w:rPr>
+                <w:rFonts w:ascii="Calibri" w:hAnsi="Calibri"/>
+                <w:b/>
+                <w:color w:val="1A2138"/>
+                <w:sz w:val="19"/>
+              </w:rPr>
+              <w:t>MAE</w:t>
+            </w:r>
+          </w:p>
+        </w:tc>
+        <w:tc>
+          <w:tcPr>
+            <w:tcW w:type="dxa" w:w="1422"/>
+            <w:shd w:val="clear" w:fill="F5EFE1"/>
+          </w:tcPr>
+          <w:p>
+            <w:pPr>
+              <w:spacing w:after="40"/>
+            </w:pPr>
+            <w:r>
+              <w:rPr>
+                <w:rFonts w:ascii="Calibri" w:hAnsi="Calibri"/>
+                <w:b/>
+                <w:color w:val="1A2138"/>
+                <w:sz w:val="19"/>
+              </w:rPr>
+              <w:t>RMSE</w:t>
+            </w:r>
+          </w:p>
+        </w:tc>
+        <w:tc>
+          <w:tcPr>
+            <w:tcW w:type="dxa" w:w="1622"/>
+            <w:shd w:val="clear" w:fill="F5EFE1"/>
+          </w:tcPr>
+          <w:p>
+            <w:pPr>
+              <w:spacing w:after="40"/>
+            </w:pPr>
+            <w:r>
+              <w:rPr>
+                <w:rFonts w:ascii="Calibri" w:hAnsi="Calibri"/>
+                <w:b/>
+                <w:color w:val="1A2138"/>
+                <w:sz w:val="19"/>
+              </w:rPr>
+              <w:t>R²</w:t>
+            </w:r>
+          </w:p>
+        </w:tc>
+        <w:tc>
+          <w:tcPr>
+            <w:tcW w:type="dxa" w:w="1622"/>
+            <w:shd w:val="clear" w:fill="F5EFE1"/>
+          </w:tcPr>
+          <w:p>
+            <w:pPr>
+              <w:spacing w:after="40"/>
+            </w:pPr>
+            <w:r>
+              <w:rPr>
+                <w:rFonts w:ascii="Calibri" w:hAnsi="Calibri"/>
+                <w:b/>
+                <w:color w:val="1A2138"/>
+                <w:sz w:val="19"/>
+              </w:rPr>
+              <w:t>80 % degli errori entro</w:t>
+            </w:r>
+          </w:p>
+        </w:tc>
+      </w:tr>
+      <w:tr>
+        <w:tc>
+          <w:tcPr>
+            <w:tcW w:type="dxa" w:w="2324"/>
+          </w:tcPr>
+          <w:p>
+            <w:pPr>
+              <w:spacing w:after="40"/>
+            </w:pPr>
+            <w:r>
+              <w:rPr>
+                <w:rFonts w:ascii="Calibri" w:hAnsi="Calibri"/>
+                <w:b w:val="0"/>
+                <w:i w:val="0"/>
+                <w:color w:val="1A2138"/>
+                <w:sz w:val="19"/>
+              </w:rPr>
+              <w:t>Media globale del periodo di addestramento</w:t>
+            </w:r>
+          </w:p>
+        </w:tc>
+        <w:tc>
+          <w:tcPr>
+            <w:tcW w:type="dxa" w:w="1622"/>
+          </w:tcPr>
+          <w:p>
+            <w:pPr>
+              <w:spacing w:after="40"/>
+            </w:pPr>
+            <w:r>
+              <w:rPr>
+                <w:rFonts w:ascii="Calibri" w:hAnsi="Calibri"/>
+                <w:b w:val="0"/>
+                <w:i w:val="0"/>
+                <w:color w:val="1A2138"/>
+                <w:sz w:val="19"/>
+              </w:rPr>
+              <w:t>6,46 kg</w:t>
+            </w:r>
+          </w:p>
+        </w:tc>
+        <w:tc>
+          <w:tcPr>
+            <w:tcW w:type="dxa" w:w="1422"/>
+          </w:tcPr>
+          <w:p>
+            <w:pPr>
+              <w:spacing w:after="40"/>
+            </w:pPr>
+            <w:r>
+              <w:rPr>
+                <w:rFonts w:ascii="Calibri" w:hAnsi="Calibri"/>
+                <w:b w:val="0"/>
+                <w:i w:val="0"/>
+                <w:color w:val="1A2138"/>
+                <w:sz w:val="19"/>
+              </w:rPr>
+              <w:t>8,19</w:t>
+            </w:r>
+          </w:p>
+        </w:tc>
+        <w:tc>
+          <w:tcPr>
+            <w:tcW w:type="dxa" w:w="1622"/>
+          </w:tcPr>
+          <w:p>
+            <w:pPr>
+              <w:spacing w:after="40"/>
+            </w:pPr>
+            <w:r>
+              <w:rPr>
+                <w:rFonts w:ascii="Calibri" w:hAnsi="Calibri"/>
+                <w:b w:val="0"/>
+                <w:i w:val="0"/>
+                <w:color w:val="1A2138"/>
+                <w:sz w:val="19"/>
+              </w:rPr>
+              <w:t>−0,257</w:t>
+            </w:r>
+          </w:p>
+        </w:tc>
+        <w:tc>
+          <w:tcPr>
+            <w:tcW w:type="dxa" w:w="1622"/>
+          </w:tcPr>
+          <w:p>
+            <w:pPr>
+              <w:spacing w:after="40"/>
+            </w:pPr>
+            <w:r>
+              <w:rPr>
+                <w:rFonts w:ascii="Calibri" w:hAnsi="Calibri"/>
+                <w:b w:val="0"/>
+                <w:i w:val="0"/>
+                <w:color w:val="1A2138"/>
+                <w:sz w:val="19"/>
+              </w:rPr>
+              <w:t>± 11,1 kg</w:t>
+            </w:r>
+          </w:p>
+        </w:tc>
+      </w:tr>
+      <w:tr>
+        <w:tc>
+          <w:tcPr>
+            <w:tcW w:type="dxa" w:w="2324"/>
+          </w:tcPr>
+          <w:p>
+            <w:pPr>
+              <w:spacing w:after="40"/>
+            </w:pPr>
+            <w:r>
+              <w:rPr>
+                <w:rFonts w:ascii="Calibri" w:hAnsi="Calibri"/>
+                <w:b w:val="0"/>
+                <w:i w:val="0"/>
+                <w:color w:val="1A2138"/>
+                <w:sz w:val="19"/>
+              </w:rPr>
+              <w:t>Media dello stato</w:t>
+            </w:r>
+          </w:p>
+        </w:tc>
+        <w:tc>
+          <w:tcPr>
+            <w:tcW w:type="dxa" w:w="1622"/>
+          </w:tcPr>
+          <w:p>
+            <w:pPr>
+              <w:spacing w:after="40"/>
+            </w:pPr>
+            <w:r>
+              <w:rPr>
+                <w:rFonts w:ascii="Calibri" w:hAnsi="Calibri"/>
+                <w:b w:val="0"/>
+                <w:i w:val="0"/>
+                <w:color w:val="1A2138"/>
+                <w:sz w:val="19"/>
+              </w:rPr>
+              <w:t>5,73 kg</w:t>
+            </w:r>
+          </w:p>
+        </w:tc>
+        <w:tc>
+          <w:tcPr>
+            <w:tcW w:type="dxa" w:w="1422"/>
+          </w:tcPr>
+          <w:p>
+            <w:pPr>
+              <w:spacing w:after="40"/>
+            </w:pPr>
+            <w:r>
+              <w:rPr>
+                <w:rFonts w:ascii="Calibri" w:hAnsi="Calibri"/>
+                <w:b w:val="0"/>
+                <w:i w:val="0"/>
+                <w:color w:val="1A2138"/>
+                <w:sz w:val="19"/>
+              </w:rPr>
+              <w:t>6,80</w:t>
+            </w:r>
+          </w:p>
+        </w:tc>
+        <w:tc>
+          <w:tcPr>
+            <w:tcW w:type="dxa" w:w="1622"/>
+          </w:tcPr>
+          <w:p>
+            <w:pPr>
+              <w:spacing w:after="40"/>
+            </w:pPr>
+            <w:r>
+              <w:rPr>
+                <w:rFonts w:ascii="Calibri" w:hAnsi="Calibri"/>
+                <w:b w:val="0"/>
+                <w:i w:val="0"/>
+                <w:color w:val="1A2138"/>
+                <w:sz w:val="19"/>
+              </w:rPr>
+              <w:t>0,134</w:t>
+            </w:r>
+          </w:p>
+        </w:tc>
+        <w:tc>
+          <w:tcPr>
+            <w:tcW w:type="dxa" w:w="1622"/>
+          </w:tcPr>
+          <w:p>
+            <w:pPr>
+              <w:spacing w:after="40"/>
+            </w:pPr>
+            <w:r>
+              <w:rPr>
+                <w:rFonts w:ascii="Calibri" w:hAnsi="Calibri"/>
+                <w:b w:val="0"/>
+                <w:i w:val="0"/>
+                <w:color w:val="1A2138"/>
+                <w:sz w:val="19"/>
+              </w:rPr>
+              <w:t>± 8,8 kg</w:t>
+            </w:r>
+          </w:p>
+        </w:tc>
+      </w:tr>
+      <w:tr>
+        <w:tc>
+          <w:tcPr>
+            <w:tcW w:type="dxa" w:w="2324"/>
+          </w:tcPr>
+          <w:p>
+            <w:pPr>
+              <w:spacing w:after="40"/>
+            </w:pPr>
+            <w:r>
+              <w:rPr>
+                <w:rFonts w:ascii="Calibri" w:hAnsi="Calibri"/>
+                <w:b w:val="0"/>
+                <w:i w:val="0"/>
+                <w:color w:val="1A2138"/>
+                <w:sz w:val="19"/>
+              </w:rPr>
+              <w:t>Media dello stato + tendenza annuale</w:t>
+            </w:r>
+          </w:p>
+        </w:tc>
+        <w:tc>
+          <w:tcPr>
+            <w:tcW w:type="dxa" w:w="1622"/>
+          </w:tcPr>
+          <w:p>
+            <w:pPr>
+              <w:spacing w:after="40"/>
+            </w:pPr>
+            <w:r>
+              <w:rPr>
+                <w:rFonts w:ascii="Calibri" w:hAnsi="Calibri"/>
+                <w:b/>
+                <w:i w:val="0"/>
+                <w:color w:val="1A2138"/>
+                <w:sz w:val="19"/>
+              </w:rPr>
+              <w:t>4,25 kg</w:t>
+            </w:r>
+          </w:p>
+        </w:tc>
+        <w:tc>
+          <w:tcPr>
+            <w:tcW w:type="dxa" w:w="1422"/>
+          </w:tcPr>
+          <w:p>
+            <w:pPr>
+              <w:spacing w:after="40"/>
+            </w:pPr>
+            <w:r>
+              <w:rPr>
+                <w:rFonts w:ascii="Calibri" w:hAnsi="Calibri"/>
+                <w:b w:val="0"/>
+                <w:i w:val="0"/>
+                <w:color w:val="1A2138"/>
+                <w:sz w:val="19"/>
+              </w:rPr>
+              <w:t>5,46</w:t>
+            </w:r>
+          </w:p>
+        </w:tc>
+        <w:tc>
+          <w:tcPr>
+            <w:tcW w:type="dxa" w:w="1622"/>
+          </w:tcPr>
+          <w:p>
+            <w:pPr>
+              <w:spacing w:after="40"/>
+            </w:pPr>
+            <w:r>
+              <w:rPr>
+                <w:rFonts w:ascii="Calibri" w:hAnsi="Calibri"/>
+                <w:b w:val="0"/>
+                <w:i w:val="0"/>
+                <w:color w:val="1A2138"/>
+                <w:sz w:val="19"/>
+              </w:rPr>
+              <w:t>0,442</w:t>
+            </w:r>
+          </w:p>
+        </w:tc>
+        <w:tc>
+          <w:tcPr>
+            <w:tcW w:type="dxa" w:w="1622"/>
+          </w:tcPr>
+          <w:p>
+            <w:pPr>
+              <w:spacing w:after="40"/>
+            </w:pPr>
+            <w:r>
+              <w:rPr>
+                <w:rFonts w:ascii="Calibri" w:hAnsi="Calibri"/>
+                <w:b/>
+                <w:i w:val="0"/>
+                <w:color w:val="1A2138"/>
+                <w:sz w:val="19"/>
+              </w:rPr>
+              <w:t>± 6,1 kg</w:t>
+            </w:r>
+          </w:p>
+        </w:tc>
+      </w:tr>
+    </w:tbl>
+    <w:p>
+      <w:pPr>
+        <w:spacing w:after="120"/>
+      </w:pPr>
+    </w:p>
+    <w:p>
+      <w:pPr>
+        <w:jc w:val="both"/>
+      </w:pPr>
+      <w:r>
+        <w:rPr>
+          <w:rFonts w:ascii="Calibri" w:hAnsi="Calibri"/>
+          <w:b w:val="0"/>
+          <w:i w:val="0"/>
+          <w:color w:val="1A2138"/>
+          <w:sz w:val="21"/>
+        </w:rPr>
+        <w:t>Due cose vanno notate.</w:t>
+      </w:r>
+    </w:p>
+    <w:p>
+      <w:pPr>
+        <w:jc w:val="both"/>
+      </w:pPr>
+      <w:r>
+        <w:rPr>
+          <w:rFonts w:ascii="Calibri" w:hAnsi="Calibri"/>
+          <w:b/>
+          <w:i w:val="0"/>
+          <w:color w:val="1A2138"/>
+          <w:sz w:val="21"/>
+        </w:rPr>
+        <w:t>L'R² negativo della prima riga</w:t>
+      </w:r>
+      <w:r>
+        <w:rPr>
+          <w:rFonts w:ascii="Calibri" w:hAnsi="Calibri"/>
+          <w:b w:val="0"/>
+          <w:i w:val="0"/>
+          <w:color w:val="1A2138"/>
+          <w:sz w:val="21"/>
+        </w:rPr>
+        <w:t xml:space="preserve"> significa che predire la media del passato è </w:t>
+      </w:r>
+      <w:r>
+        <w:rPr>
+          <w:rFonts w:ascii="Calibri" w:hAnsi="Calibri"/>
+          <w:b w:val="0"/>
+          <w:i/>
+          <w:color w:val="1A2138"/>
+          <w:sz w:val="21"/>
+        </w:rPr>
+        <w:t>peggio</w:t>
+      </w:r>
+      <w:r>
+        <w:rPr>
+          <w:rFonts w:ascii="Calibri" w:hAnsi="Calibri"/>
+          <w:b w:val="0"/>
+          <w:i w:val="0"/>
+          <w:color w:val="1A2138"/>
+          <w:sz w:val="21"/>
+        </w:rPr>
+        <w:t xml:space="preserve"> che predire la media del futuro: la resa è calata, quindi il passato sistematicamente sovrastima. È la conferma numerica dell'osservazione 3.</w:t>
+      </w:r>
+    </w:p>
+    <w:p>
+      <w:pPr>
+        <w:jc w:val="both"/>
+      </w:pPr>
+      <w:r>
+        <w:rPr>
+          <w:rFonts w:ascii="Calibri" w:hAnsi="Calibri"/>
+          <w:b/>
+          <w:i w:val="0"/>
+          <w:color w:val="1A2138"/>
+          <w:sz w:val="21"/>
+        </w:rPr>
+        <w:t>La tendenza annuale vale più dello stato</w:t>
+      </w:r>
+      <w:r>
+        <w:rPr>
+          <w:rFonts w:ascii="Calibri" w:hAnsi="Calibri"/>
+          <w:b w:val="0"/>
+          <w:i w:val="0"/>
+          <w:color w:val="1A2138"/>
+          <w:sz w:val="21"/>
+        </w:rPr>
+        <w:t xml:space="preserve">, su dati futuri: aggiungerla porta il MAE da 5,73 a 4,25 kg. La pendenza stimata sul solo periodo di addestramento è </w:t>
+      </w:r>
+      <w:r>
+        <w:rPr>
+          <w:rFonts w:ascii="Calibri" w:hAnsi="Calibri"/>
+          <w:b/>
+          <w:i w:val="0"/>
+          <w:color w:val="1A2138"/>
+          <w:sz w:val="21"/>
+        </w:rPr>
+        <w:t>−0,468 kg all'anno</w:t>
+      </w:r>
+      <w:r>
+        <w:rPr>
+          <w:rFonts w:ascii="Calibri" w:hAnsi="Calibri"/>
+          <w:b w:val="0"/>
+          <w:i w:val="0"/>
+          <w:color w:val="1A2138"/>
+          <w:sz w:val="21"/>
+        </w:rPr>
+        <w:t>, coerente con i −0,537 kg/anno misurati sull'intero pannello bilanciato.</w:t>
+      </w:r>
+    </w:p>
+    <w:p>
+      <w:pPr>
+        <w:pStyle w:val="Heading3"/>
+      </w:pPr>
+      <w:r>
+        <w:rPr>
+          <w:rFonts w:ascii="Calibri" w:hAnsi="Calibri"/>
+          <w:b w:val="0"/>
+          <w:i w:val="0"/>
+          <w:color w:val="A87200"/>
+          <w:sz w:val="23"/>
+        </w:rPr>
+        <w:t>La soglia per M4</w:t>
+      </w:r>
+    </w:p>
+    <w:p>
+      <w:pPr>
+        <w:spacing w:after="200"/>
+        <w:ind w:left="283"/>
+        <w:pBdr>
+          <w:left w:val="single" w:sz="12" w:space="6" w:color="A87200"/>
+        </w:pBdr>
+      </w:pPr>
+      <w:r>
+        <w:rPr>
+          <w:rFonts w:ascii="Calibri" w:hAnsi="Calibri"/>
+          <w:b w:val="0"/>
+          <w:i w:val="0"/>
+          <w:color w:val="5B6178"/>
+          <w:sz w:val="20"/>
+        </w:rPr>
+        <w:t xml:space="preserve">Un modello di machine learning che non scende </w:t>
+      </w:r>
+      <w:r>
+        <w:rPr>
+          <w:rFonts w:ascii="Calibri" w:hAnsi="Calibri"/>
+          <w:b/>
+          <w:i w:val="0"/>
+          <w:color w:val="5B6178"/>
+          <w:sz w:val="20"/>
+        </w:rPr>
+        <w:t>sotto 4,25 kg di MAE</w:t>
+      </w:r>
+      <w:r>
+        <w:rPr>
+          <w:rFonts w:ascii="Calibri" w:hAnsi="Calibri"/>
+          <w:b w:val="0"/>
+          <w:i w:val="0"/>
+          <w:color w:val="5B6178"/>
+          <w:sz w:val="20"/>
+        </w:rPr>
+        <w:t xml:space="preserve"> su una divisione temporale non serve a niente: due medie e una retta fanno lo stesso.</w:t>
+      </w:r>
+    </w:p>
+    <w:p>
+      <w:pPr>
+        <w:jc w:val="both"/>
+      </w:pPr>
+      <w:r>
+        <w:rPr>
+          <w:rFonts w:ascii="Calibri" w:hAnsi="Calibri"/>
+          <w:b w:val="0"/>
+          <w:i w:val="0"/>
+          <w:color w:val="1A2138"/>
+          <w:sz w:val="21"/>
+        </w:rPr>
+        <w:t xml:space="preserve">Questo numero va in </w:t>
+      </w:r>
+      <w:r>
+        <w:rPr>
+          <w:rFonts w:ascii="Consolas" w:hAnsi="Consolas"/>
+          <w:b w:val="0"/>
+          <w:i w:val="0"/>
+          <w:color w:val="7A5200"/>
+          <w:sz w:val="20"/>
+        </w:rPr>
+        <w:t>docs/M4-machine-learning/</w:t>
+      </w:r>
+      <w:r>
+        <w:rPr>
+          <w:rFonts w:ascii="Calibri" w:hAnsi="Calibri"/>
+          <w:b w:val="0"/>
+          <w:i w:val="0"/>
+          <w:color w:val="1A2138"/>
+          <w:sz w:val="21"/>
+        </w:rPr>
+        <w:t xml:space="preserve"> come criterio di accettazione, e va detto in sede di presentazione. Un progetto che dichiara la propria soglia di riferimento è molto più credibile di uno che mostra un R² senza contesto.</w:t>
+      </w:r>
+    </w:p>
+    <w:p>
+      <w:pPr>
+        <w:spacing w:before="120" w:after="200"/>
+        <w:pBdr>
+          <w:bottom w:val="single" w:sz="6" w:space="6" w:color="D9D2C4"/>
+        </w:pBdr>
+      </w:pPr>
+    </w:p>
+    <w:p>
+      <w:pPr>
+        <w:pStyle w:val="Heading2"/>
+      </w:pPr>
+      <w:r>
+        <w:rPr>
+          <w:rFonts w:ascii="Calibri" w:hAnsi="Calibri"/>
+          <w:b w:val="0"/>
+          <w:i w:val="0"/>
+          <w:color w:val="1A2138"/>
+          <w:sz w:val="26"/>
+        </w:rPr>
+        <w:t>Limiti di trasferibilità</w:t>
+      </w:r>
+    </w:p>
+    <w:p>
+      <w:pPr>
+        <w:jc w:val="both"/>
+      </w:pPr>
+      <w:r>
+        <w:rPr>
+          <w:rFonts w:ascii="Calibri" w:hAnsi="Calibri"/>
+          <w:b w:val="0"/>
+          <w:i w:val="0"/>
+          <w:color w:val="1A2138"/>
+          <w:sz w:val="21"/>
+        </w:rPr>
+        <w:t xml:space="preserve">I dati descrivono </w:t>
+      </w:r>
+      <w:r>
+        <w:rPr>
+          <w:rFonts w:ascii="Calibri" w:hAnsi="Calibri"/>
+          <w:b/>
+          <w:i w:val="0"/>
+          <w:color w:val="1A2138"/>
+          <w:sz w:val="21"/>
+        </w:rPr>
+        <w:t>apicoltura commerciale statunitense, aggregata per stato, dal 1998 al 2012</w:t>
+      </w:r>
+      <w:r>
+        <w:rPr>
+          <w:rFonts w:ascii="Calibri" w:hAnsi="Calibri"/>
+          <w:b w:val="0"/>
+          <w:i w:val="0"/>
+          <w:color w:val="1A2138"/>
+          <w:sz w:val="21"/>
+        </w:rPr>
+        <w:t xml:space="preserve">. L'utente è un </w:t>
+      </w:r>
+      <w:r>
+        <w:rPr>
+          <w:rFonts w:ascii="Calibri" w:hAnsi="Calibri"/>
+          <w:b/>
+          <w:i w:val="0"/>
+          <w:color w:val="1A2138"/>
+          <w:sz w:val="21"/>
+        </w:rPr>
+        <w:t>apicoltore amatoriale italiano nel 2026</w:t>
+      </w:r>
+      <w:r>
+        <w:rPr>
+          <w:rFonts w:ascii="Calibri" w:hAnsi="Calibri"/>
+          <w:b w:val="0"/>
+          <w:i w:val="0"/>
+          <w:color w:val="1A2138"/>
+          <w:sz w:val="21"/>
+        </w:rPr>
+        <w:t>. Fra le due cose ci sono cinque distanze, tutte reali.</w:t>
+      </w:r>
+    </w:p>
+    <w:p>
+      <w:pPr>
+        <w:jc w:val="both"/>
+      </w:pPr>
+      <w:r>
+        <w:rPr>
+          <w:rFonts w:ascii="Calibri" w:hAnsi="Calibri"/>
+          <w:b/>
+          <w:i w:val="0"/>
+          <w:color w:val="1A2138"/>
+          <w:sz w:val="21"/>
+        </w:rPr>
+        <w:t>1. Aggregazione.</w:t>
+      </w:r>
+      <w:r>
+        <w:rPr>
+          <w:rFonts w:ascii="Calibri" w:hAnsi="Calibri"/>
+          <w:b w:val="0"/>
+          <w:i w:val="0"/>
+          <w:color w:val="1A2138"/>
+          <w:sz w:val="21"/>
+        </w:rPr>
+        <w:t xml:space="preserve"> Una riga è la media di uno stato intero: migliaia di apiari, gestiti in modi diversi, in climi diversi. La media di uno stato non descrive nessun apiario in particolare, esattamente come il reddito medio di una regione non descrive nessuna famiglia.</w:t>
+      </w:r>
+    </w:p>
+    <w:p>
+      <w:pPr>
+        <w:jc w:val="both"/>
+      </w:pPr>
+      <w:r>
+        <w:rPr>
+          <w:rFonts w:ascii="Calibri" w:hAnsi="Calibri"/>
+          <w:b/>
+          <w:i w:val="0"/>
+          <w:color w:val="1A2138"/>
+          <w:sz w:val="21"/>
+        </w:rPr>
+        <w:t>2. Scala e gestione.</w:t>
+      </w:r>
+      <w:r>
+        <w:rPr>
+          <w:rFonts w:ascii="Calibri" w:hAnsi="Calibri"/>
+          <w:b w:val="0"/>
+          <w:i w:val="0"/>
+          <w:color w:val="1A2138"/>
+          <w:sz w:val="21"/>
+        </w:rPr>
+        <w:t xml:space="preserve"> L'apicoltura commerciale americana pratica il nomadismo — gli alveari vengono spostati sulle fioriture e affittati per l'impollinazione — usa selezione genetica, alimentazione di sostegno e trattamenti programmati. Un amatore con tre arnie fisse in giardino lavora in condizioni diverse.</w:t>
+      </w:r>
+    </w:p>
+    <w:p>
+      <w:pPr>
+        <w:jc w:val="both"/>
+      </w:pPr>
+      <w:r>
+        <w:rPr>
+          <w:rFonts w:ascii="Calibri" w:hAnsi="Calibri"/>
+          <w:b/>
+          <w:i w:val="0"/>
+          <w:color w:val="1A2138"/>
+          <w:sz w:val="21"/>
+        </w:rPr>
+        <w:t>3. Geografia.</w:t>
+      </w:r>
+      <w:r>
+        <w:rPr>
+          <w:rFonts w:ascii="Calibri" w:hAnsi="Calibri"/>
+          <w:b w:val="0"/>
+          <w:i w:val="0"/>
+          <w:color w:val="1A2138"/>
+          <w:sz w:val="21"/>
+        </w:rPr>
+        <w:t xml:space="preserve"> Nessuno stato del dataset ha il clima italiano. Le rese vanno da 31 lb del Maine a 98 lb delle Hawaii: il modello impara differenze fra climi statunitensi, e l'Italia non è nella mappa.</w:t>
+      </w:r>
+    </w:p>
+    <w:p>
+      <w:pPr>
+        <w:jc w:val="both"/>
+      </w:pPr>
+      <w:r>
+        <w:rPr>
+          <w:rFonts w:ascii="Calibri" w:hAnsi="Calibri"/>
+          <w:b/>
+          <w:i w:val="0"/>
+          <w:color w:val="1A2138"/>
+          <w:sz w:val="21"/>
+        </w:rPr>
+        <w:t>4. Epoca.</w:t>
+      </w:r>
+      <w:r>
+        <w:rPr>
+          <w:rFonts w:ascii="Calibri" w:hAnsi="Calibri"/>
+          <w:b w:val="0"/>
+          <w:i w:val="0"/>
+          <w:color w:val="1A2138"/>
+          <w:sz w:val="21"/>
+        </w:rPr>
+        <w:t xml:space="preserve"> I dati si fermano al 2012. Da allora sono cambiati il clima, la diffusione della varroa e le pratiche di gestione. Il modello estrapola di quattordici anni, e la tendenza che ha imparato (−0,47 kg/anno) non è detto sia proseguita in modo lineare.</w:t>
+      </w:r>
+    </w:p>
+    <w:p>
+      <w:pPr>
+        <w:jc w:val="both"/>
+      </w:pPr>
+      <w:r>
+        <w:rPr>
+          <w:rFonts w:ascii="Calibri" w:hAnsi="Calibri"/>
+          <w:b/>
+          <w:i w:val="0"/>
+          <w:color w:val="1A2138"/>
+          <w:sz w:val="21"/>
+        </w:rPr>
+        <w:t>5. Variabili assenti.</w:t>
+      </w:r>
+      <w:r>
+        <w:rPr>
+          <w:rFonts w:ascii="Calibri" w:hAnsi="Calibri"/>
+          <w:b w:val="0"/>
+          <w:i w:val="0"/>
+          <w:color w:val="1A2138"/>
+          <w:sz w:val="21"/>
+        </w:rPr>
+        <w:t xml:space="preserve"> Il dataset non contiene nulla di ciò che l'apicoltore osserva davvero: forza della famiglia, presenza della regina, carico di varroa, fioriture disponibili, andamento meteorologico della stagione. Il modello lavora con </w:t>
+      </w:r>
+      <w:r>
+        <w:rPr>
+          <w:rFonts w:ascii="Consolas" w:hAnsi="Consolas"/>
+          <w:b w:val="0"/>
+          <w:i w:val="0"/>
+          <w:color w:val="7A5200"/>
+          <w:sz w:val="20"/>
+        </w:rPr>
+        <w:t>stato</w:t>
+      </w:r>
+      <w:r>
+        <w:rPr>
+          <w:rFonts w:ascii="Calibri" w:hAnsi="Calibri"/>
+          <w:b w:val="0"/>
+          <w:i w:val="0"/>
+          <w:color w:val="1A2138"/>
+          <w:sz w:val="21"/>
+        </w:rPr>
+        <w:t xml:space="preserve"> e </w:t>
+      </w:r>
+      <w:r>
+        <w:rPr>
+          <w:rFonts w:ascii="Consolas" w:hAnsi="Consolas"/>
+          <w:b w:val="0"/>
+          <w:i w:val="0"/>
+          <w:color w:val="7A5200"/>
+          <w:sz w:val="20"/>
+        </w:rPr>
+        <w:t>anno</w:t>
+      </w:r>
+      <w:r>
+        <w:rPr>
+          <w:rFonts w:ascii="Calibri" w:hAnsi="Calibri"/>
+          <w:b w:val="0"/>
+          <w:i w:val="0"/>
+          <w:color w:val="1A2138"/>
+          <w:sz w:val="21"/>
+        </w:rPr>
+        <w:t>, cioè con proxy grossolane.</w:t>
+      </w:r>
+    </w:p>
+    <w:p>
+      <w:pPr>
+        <w:pStyle w:val="Heading3"/>
+      </w:pPr>
+      <w:r>
+        <w:rPr>
+          <w:rFonts w:ascii="Calibri" w:hAnsi="Calibri"/>
+          <w:b w:val="0"/>
+          <w:i w:val="0"/>
+          <w:color w:val="A87200"/>
+          <w:sz w:val="23"/>
+        </w:rPr>
+        <w:t>Cosa possiamo e non possiamo dire</w:t>
       </w:r>
     </w:p>
     <w:tbl>
@@ -10590,6 +13111,874 @@
                 <w:color w:val="1A2138"/>
                 <w:sz w:val="19"/>
               </w:rPr>
+              <w:t>Possiamo dire</w:t>
+            </w:r>
+          </w:p>
+        </w:tc>
+        <w:tc>
+          <w:tcPr>
+            <w:tcW w:type="dxa" w:w="4559"/>
+            <w:shd w:val="clear" w:fill="F5EFE1"/>
+          </w:tcPr>
+          <w:p>
+            <w:pPr>
+              <w:spacing w:after="40"/>
+            </w:pPr>
+            <w:r>
+              <w:rPr>
+                <w:rFonts w:ascii="Calibri" w:hAnsi="Calibri"/>
+                <w:b/>
+                <w:color w:val="1A2138"/>
+                <w:sz w:val="19"/>
+              </w:rPr>
+              <w:t>Non possiamo dire</w:t>
+            </w:r>
+          </w:p>
+        </w:tc>
+      </w:tr>
+      <w:tr>
+        <w:tc>
+          <w:tcPr>
+            <w:tcW w:type="dxa" w:w="4053"/>
+          </w:tcPr>
+          <w:p>
+            <w:pPr>
+              <w:spacing w:after="40"/>
+            </w:pPr>
+            <w:r>
+              <w:rPr>
+                <w:rFonts w:ascii="Calibri" w:hAnsi="Calibri"/>
+                <w:b w:val="0"/>
+                <w:i w:val="0"/>
+                <w:color w:val="1A2138"/>
+                <w:sz w:val="19"/>
+              </w:rPr>
+              <w:t>«In condizioni paragonabili a quelle rilevate negli Stati Uniti, una colonia produce fra i 18 e i 40 kg»</w:t>
+            </w:r>
+          </w:p>
+        </w:tc>
+        <w:tc>
+          <w:tcPr>
+            <w:tcW w:type="dxa" w:w="4559"/>
+          </w:tcPr>
+          <w:p>
+            <w:pPr>
+              <w:spacing w:after="40"/>
+            </w:pPr>
+            <w:r>
+              <w:rPr>
+                <w:rFonts w:ascii="Calibri" w:hAnsi="Calibri"/>
+                <w:b w:val="0"/>
+                <w:i w:val="0"/>
+                <w:color w:val="1A2138"/>
+                <w:sz w:val="19"/>
+              </w:rPr>
+              <w:t>«Il tuo alveare produrrà 27,4 kg»</w:t>
+            </w:r>
+          </w:p>
+        </w:tc>
+      </w:tr>
+      <w:tr>
+        <w:tc>
+          <w:tcPr>
+            <w:tcW w:type="dxa" w:w="4053"/>
+          </w:tcPr>
+          <w:p>
+            <w:pPr>
+              <w:spacing w:after="40"/>
+            </w:pPr>
+            <w:r>
+              <w:rPr>
+                <w:rFonts w:ascii="Calibri" w:hAnsi="Calibri"/>
+                <w:b w:val="0"/>
+                <w:i w:val="0"/>
+                <w:color w:val="1A2138"/>
+                <w:sz w:val="19"/>
+              </w:rPr>
+              <w:t>«La resa media è calata di circa mezzo chilo all'anno fra il 1998 e il 2012»</w:t>
+            </w:r>
+          </w:p>
+        </w:tc>
+        <w:tc>
+          <w:tcPr>
+            <w:tcW w:type="dxa" w:w="4559"/>
+          </w:tcPr>
+          <w:p>
+            <w:pPr>
+              <w:spacing w:after="40"/>
+            </w:pPr>
+            <w:r>
+              <w:rPr>
+                <w:rFonts w:ascii="Calibri" w:hAnsi="Calibri"/>
+                <w:b w:val="0"/>
+                <w:i w:val="0"/>
+                <w:color w:val="1A2138"/>
+                <w:sz w:val="19"/>
+              </w:rPr>
+              <w:t>«La tua resa calerà dello 0,5 kg l'anno prossimo»</w:t>
+            </w:r>
+          </w:p>
+        </w:tc>
+      </w:tr>
+      <w:tr>
+        <w:tc>
+          <w:tcPr>
+            <w:tcW w:type="dxa" w:w="4053"/>
+          </w:tcPr>
+          <w:p>
+            <w:pPr>
+              <w:spacing w:after="40"/>
+            </w:pPr>
+            <w:r>
+              <w:rPr>
+                <w:rFonts w:ascii="Calibri" w:hAnsi="Calibri"/>
+                <w:b w:val="0"/>
+                <w:i w:val="0"/>
+                <w:color w:val="1A2138"/>
+                <w:sz w:val="19"/>
+              </w:rPr>
+              <w:t>«La posizione geografica spiega circa due terzi delle differenze di resa»</w:t>
+            </w:r>
+          </w:p>
+        </w:tc>
+        <w:tc>
+          <w:tcPr>
+            <w:tcW w:type="dxa" w:w="4559"/>
+          </w:tcPr>
+          <w:p>
+            <w:pPr>
+              <w:spacing w:after="40"/>
+            </w:pPr>
+            <w:r>
+              <w:rPr>
+                <w:rFonts w:ascii="Calibri" w:hAnsi="Calibri"/>
+                <w:b w:val="0"/>
+                <w:i w:val="0"/>
+                <w:color w:val="1A2138"/>
+                <w:sz w:val="19"/>
+              </w:rPr>
+              <w:t>«Spostando l'apiario guadagni X kg»</w:t>
+            </w:r>
+          </w:p>
+        </w:tc>
+      </w:tr>
+      <w:tr>
+        <w:tc>
+          <w:tcPr>
+            <w:tcW w:type="dxa" w:w="4053"/>
+          </w:tcPr>
+          <w:p>
+            <w:pPr>
+              <w:spacing w:after="40"/>
+            </w:pPr>
+            <w:r>
+              <w:rPr>
+                <w:rFonts w:ascii="Calibri" w:hAnsi="Calibri"/>
+                <w:b w:val="0"/>
+                <w:i w:val="0"/>
+                <w:color w:val="1A2138"/>
+                <w:sz w:val="19"/>
+              </w:rPr>
+              <w:t>«Questa è una stima statistica di riferimento, non una previsione sul tuo apiario»</w:t>
+            </w:r>
+          </w:p>
+        </w:tc>
+        <w:tc>
+          <w:tcPr>
+            <w:tcW w:type="dxa" w:w="4559"/>
+          </w:tcPr>
+          <w:p>
+            <w:pPr>
+              <w:spacing w:after="40"/>
+            </w:pPr>
+            <w:r>
+              <w:rPr>
+                <w:rFonts w:ascii="Calibri" w:hAnsi="Calibri"/>
+                <w:b w:val="0"/>
+                <w:i w:val="0"/>
+                <w:color w:val="1A2138"/>
+                <w:sz w:val="19"/>
+              </w:rPr>
+              <w:t>«Il modello ha un'accuratezza del 90 %»</w:t>
+            </w:r>
+          </w:p>
+        </w:tc>
+      </w:tr>
+    </w:tbl>
+    <w:p>
+      <w:pPr>
+        <w:spacing w:after="120"/>
+      </w:pPr>
+    </w:p>
+    <w:p>
+      <w:pPr>
+        <w:jc w:val="both"/>
+      </w:pPr>
+      <w:r>
+        <w:rPr>
+          <w:rFonts w:ascii="Calibri" w:hAnsi="Calibri"/>
+          <w:b w:val="0"/>
+          <w:i w:val="0"/>
+          <w:color w:val="1A2138"/>
+          <w:sz w:val="21"/>
+        </w:rPr>
+        <w:t xml:space="preserve">Il modello </w:t>
+      </w:r>
+      <w:r>
+        <w:rPr>
+          <w:rFonts w:ascii="Calibri" w:hAnsi="Calibri"/>
+          <w:b/>
+          <w:i w:val="0"/>
+          <w:color w:val="1A2138"/>
+          <w:sz w:val="21"/>
+        </w:rPr>
+        <w:t>non è uno strumento diagnostico e non sostituisce un veterinario o un tecnico apistico</w:t>
+      </w:r>
+      <w:r>
+        <w:rPr>
+          <w:rFonts w:ascii="Calibri" w:hAnsi="Calibri"/>
+          <w:b w:val="0"/>
+          <w:i w:val="0"/>
+          <w:color w:val="1A2138"/>
+          <w:sz w:val="21"/>
+        </w:rPr>
+        <w:t>. Questa frase deve comparire nell'applicazione, non solo qui: è uno dei cinque punti etici obbligatori (M6-T8, M7-T4).</w:t>
+      </w:r>
+    </w:p>
+    <w:p>
+      <w:pPr>
+        <w:spacing w:before="120" w:after="200"/>
+        <w:pBdr>
+          <w:bottom w:val="single" w:sz="6" w:space="6" w:color="D9D2C4"/>
+        </w:pBdr>
+      </w:pPr>
+    </w:p>
+    <w:p>
+      <w:pPr>
+        <w:pStyle w:val="Heading2"/>
+      </w:pPr>
+      <w:r>
+        <w:rPr>
+          <w:rFonts w:ascii="Calibri" w:hAnsi="Calibri"/>
+          <w:b w:val="0"/>
+          <w:i w:val="0"/>
+          <w:color w:val="1A2138"/>
+          <w:sz w:val="26"/>
+        </w:rPr>
+        <w:t>Cosa vedrà l'utente</w:t>
+      </w:r>
+    </w:p>
+    <w:p>
+      <w:pPr>
+        <w:jc w:val="both"/>
+      </w:pPr>
+      <w:r>
+        <w:rPr>
+          <w:rFonts w:ascii="Calibri" w:hAnsi="Calibri"/>
+          <w:b w:val="0"/>
+          <w:i w:val="0"/>
+          <w:color w:val="1A2138"/>
+          <w:sz w:val="21"/>
+        </w:rPr>
+        <w:t>La decisione di M2-T3 non finisce nel modello: finisce a schermo. Un limite scritto in un documento che nessuno legge non è una mitigazione.</w:t>
+      </w:r>
+    </w:p>
+    <w:p>
+      <w:pPr>
+        <w:pStyle w:val="Heading3"/>
+      </w:pPr>
+      <w:r>
+        <w:rPr>
+          <w:rFonts w:ascii="Calibri" w:hAnsi="Calibri"/>
+          <w:b w:val="0"/>
+          <w:i w:val="0"/>
+          <w:color w:val="A87200"/>
+          <w:sz w:val="23"/>
+        </w:rPr>
+        <w:t>La previsione non è mai un numero solo</w:t>
+      </w:r>
+    </w:p>
+    <w:p>
+      <w:pPr>
+        <w:spacing w:after="0" w:line="240" w:lineRule="auto"/>
+        <w:ind w:left="227"/>
+        <w:shd w:val="clear" w:fill="F4F4F2"/>
+      </w:pPr>
+      <w:r>
+        <w:rPr>
+          <w:rFonts w:ascii="Consolas" w:hAnsi="Consolas"/>
+          <w:color w:val="1A2138"/>
+          <w:sz w:val="18"/>
+        </w:rPr>
+        <w:t xml:space="preserve">        Stima di riferimento</w:t>
+      </w:r>
+    </w:p>
+    <w:p>
+      <w:pPr>
+        <w:spacing w:after="0" w:line="240" w:lineRule="auto"/>
+        <w:ind w:left="227"/>
+        <w:shd w:val="clear" w:fill="F4F4F2"/>
+      </w:pPr>
+      <w:r>
+        <w:rPr>
+          <w:rFonts w:ascii="Consolas" w:hAnsi="Consolas"/>
+          <w:color w:val="1A2138"/>
+          <w:sz w:val="18"/>
+        </w:rPr>
+        <w:t xml:space="preserve"> </w:t>
+      </w:r>
+    </w:p>
+    <w:p>
+      <w:pPr>
+        <w:spacing w:after="0" w:line="240" w:lineRule="auto"/>
+        <w:ind w:left="227"/>
+        <w:shd w:val="clear" w:fill="F4F4F2"/>
+      </w:pPr>
+      <w:r>
+        <w:rPr>
+          <w:rFonts w:ascii="Consolas" w:hAnsi="Consolas"/>
+          <w:color w:val="1A2138"/>
+          <w:sz w:val="18"/>
+        </w:rPr>
+        <w:t xml:space="preserve">        22 — 34 kg per colonia</w:t>
+      </w:r>
+    </w:p>
+    <w:p>
+      <w:pPr>
+        <w:spacing w:after="0" w:line="240" w:lineRule="auto"/>
+        <w:ind w:left="227"/>
+        <w:shd w:val="clear" w:fill="F4F4F2"/>
+      </w:pPr>
+      <w:r>
+        <w:rPr>
+          <w:rFonts w:ascii="Consolas" w:hAnsi="Consolas"/>
+          <w:color w:val="1A2138"/>
+          <w:sz w:val="18"/>
+        </w:rPr>
+        <w:t xml:space="preserve"> </w:t>
+      </w:r>
+    </w:p>
+    <w:p>
+      <w:pPr>
+        <w:spacing w:after="0" w:line="240" w:lineRule="auto"/>
+        <w:ind w:left="227"/>
+        <w:shd w:val="clear" w:fill="F4F4F2"/>
+      </w:pPr>
+      <w:r>
+        <w:rPr>
+          <w:rFonts w:ascii="Consolas" w:hAnsi="Consolas"/>
+          <w:color w:val="1A2138"/>
+          <w:sz w:val="18"/>
+        </w:rPr>
+        <w:t xml:space="preserve">        valore centrale 28 kg</w:t>
+      </w:r>
+    </w:p>
+    <w:p>
+      <w:pPr>
+        <w:spacing w:after="120"/>
+      </w:pPr>
+    </w:p>
+    <w:p>
+      <w:pPr>
+        <w:jc w:val="both"/>
+      </w:pPr>
+      <w:r>
+        <w:rPr>
+          <w:rFonts w:ascii="Calibri" w:hAnsi="Calibri"/>
+          <w:b w:val="0"/>
+          <w:i w:val="0"/>
+          <w:color w:val="1A2138"/>
+          <w:sz w:val="21"/>
+        </w:rPr>
+        <w:t xml:space="preserve">L'intervallo si costruisce sui </w:t>
+      </w:r>
+      <w:r>
+        <w:rPr>
+          <w:rFonts w:ascii="Calibri" w:hAnsi="Calibri"/>
+          <w:b/>
+          <w:i w:val="0"/>
+          <w:color w:val="1A2138"/>
+          <w:sz w:val="21"/>
+        </w:rPr>
+        <w:t>residui del modello</w:t>
+      </w:r>
+      <w:r>
+        <w:rPr>
+          <w:rFonts w:ascii="Calibri" w:hAnsi="Calibri"/>
+          <w:b w:val="0"/>
+          <w:i w:val="0"/>
+          <w:color w:val="1A2138"/>
+          <w:sz w:val="21"/>
+        </w:rPr>
+        <w:t xml:space="preserve"> misurati in M4, non su un numero deciso a tavolino. Con i modelli di riferimento attuali sarebbe di circa ± 6 kg (l'80 % degli errori sta lì dentro); il modello di M4 dovrà restringerlo, e la UI userà l'intervallo che quel modello dichiara.</w:t>
+      </w:r>
+    </w:p>
+    <w:p>
+      <w:pPr>
+        <w:jc w:val="both"/>
+      </w:pPr>
+      <w:r>
+        <w:rPr>
+          <w:rFonts w:ascii="Calibri" w:hAnsi="Calibri"/>
+          <w:b/>
+          <w:i w:val="0"/>
+          <w:color w:val="1A2138"/>
+          <w:sz w:val="21"/>
+        </w:rPr>
+        <w:t>Se un giorno l'intervallo risultasse più largo della stima stessa, la stima non va mostrata</w:t>
+      </w:r>
+      <w:r>
+        <w:rPr>
+          <w:rFonts w:ascii="Calibri" w:hAnsi="Calibri"/>
+          <w:b w:val="0"/>
+          <w:i w:val="0"/>
+          <w:color w:val="1A2138"/>
+          <w:sz w:val="21"/>
+        </w:rPr>
+        <w:t xml:space="preserve">: si mostra il messaggio che i dati disponibili non permettono una previsione utile. Un intervallo </w:t>
+      </w:r>
+      <w:r>
+        <w:rPr>
+          <w:rFonts w:ascii="Consolas" w:hAnsi="Consolas"/>
+          <w:b w:val="0"/>
+          <w:i w:val="0"/>
+          <w:color w:val="7A5200"/>
+          <w:sz w:val="20"/>
+        </w:rPr>
+        <w:t>5 – 55 kg</w:t>
+      </w:r>
+      <w:r>
+        <w:rPr>
+          <w:rFonts w:ascii="Calibri" w:hAnsi="Calibri"/>
+          <w:b w:val="0"/>
+          <w:i w:val="0"/>
+          <w:color w:val="1A2138"/>
+          <w:sz w:val="21"/>
+        </w:rPr>
+        <w:t xml:space="preserve"> non informa nessuno, e mostrarlo sarebbe peggio che tacere.</w:t>
+      </w:r>
+    </w:p>
+    <w:p>
+      <w:pPr>
+        <w:pStyle w:val="Heading3"/>
+      </w:pPr>
+      <w:r>
+        <w:rPr>
+          <w:rFonts w:ascii="Calibri" w:hAnsi="Calibri"/>
+          <w:b w:val="0"/>
+          <w:i w:val="0"/>
+          <w:color w:val="A87200"/>
+          <w:sz w:val="23"/>
+        </w:rPr>
+        <w:t>Tre elementi sempre presenti</w:t>
+      </w:r>
+    </w:p>
+    <w:p>
+      <w:pPr>
+        <w:pStyle w:val="ListNumber"/>
+        <w:spacing w:after="60"/>
+      </w:pPr>
+      <w:r>
+        <w:rPr>
+          <w:rFonts w:ascii="Calibri" w:hAnsi="Calibri"/>
+          <w:b/>
+          <w:i w:val="0"/>
+          <w:color w:val="1A2138"/>
+          <w:sz w:val="21"/>
+        </w:rPr>
+        <w:t>L'intervallo</w:t>
+      </w:r>
+      <w:r>
+        <w:rPr>
+          <w:rFonts w:ascii="Calibri" w:hAnsi="Calibri"/>
+          <w:b w:val="0"/>
+          <w:i w:val="0"/>
+          <w:color w:val="1A2138"/>
+          <w:sz w:val="21"/>
+        </w:rPr>
+        <w:t>, in evidenza, più grande del valore centrale.</w:t>
+      </w:r>
+    </w:p>
+    <w:p>
+      <w:pPr>
+        <w:pStyle w:val="ListNumber"/>
+        <w:spacing w:after="60"/>
+      </w:pPr>
+      <w:r>
+        <w:rPr>
+          <w:rFonts w:ascii="Calibri" w:hAnsi="Calibri"/>
+          <w:b/>
+          <w:i w:val="0"/>
+          <w:color w:val="1A2138"/>
+          <w:sz w:val="21"/>
+        </w:rPr>
+        <w:t>La riga di provenienza</w:t>
+      </w:r>
+      <w:r>
+        <w:rPr>
+          <w:rFonts w:ascii="Calibri" w:hAnsi="Calibri"/>
+          <w:b w:val="0"/>
+          <w:i w:val="0"/>
+          <w:color w:val="1A2138"/>
+          <w:sz w:val="21"/>
+        </w:rPr>
+        <w:t>, sotto la stima:</w:t>
+      </w:r>
+    </w:p>
+    <w:p>
+      <w:pPr>
+        <w:jc w:val="both"/>
+      </w:pPr>
+      <w:r>
+        <w:rPr>
+          <w:rFonts w:ascii="Calibri" w:hAnsi="Calibri"/>
+          <w:b w:val="0"/>
+          <w:i/>
+          <w:color w:val="1A2138"/>
+          <w:sz w:val="21"/>
+        </w:rPr>
+        <w:t>«Stima basata su dati USDA 1998-2012, apicoltura commerciale statunitense. Il tuo apiario può discostarsene sensibilmente.»</w:t>
+      </w:r>
+    </w:p>
+    <w:p>
+      <w:pPr>
+        <w:pStyle w:val="ListNumber"/>
+        <w:spacing w:after="60"/>
+      </w:pPr>
+      <w:r>
+        <w:rPr>
+          <w:rFonts w:ascii="Calibri" w:hAnsi="Calibri"/>
+          <w:b/>
+          <w:i w:val="0"/>
+          <w:color w:val="1A2138"/>
+          <w:sz w:val="21"/>
+        </w:rPr>
+        <w:t>Il collegamento alla pagina Trasparenza</w:t>
+      </w:r>
+      <w:r>
+        <w:rPr>
+          <w:rFonts w:ascii="Calibri" w:hAnsi="Calibri"/>
+          <w:b w:val="0"/>
+          <w:i w:val="0"/>
+          <w:color w:val="1A2138"/>
+          <w:sz w:val="21"/>
+        </w:rPr>
+        <w:t>, che spiega per esteso i cinque</w:t>
+      </w:r>
+    </w:p>
+    <w:p>
+      <w:pPr>
+        <w:jc w:val="both"/>
+      </w:pPr>
+      <w:r>
+        <w:rPr>
+          <w:rFonts w:ascii="Calibri" w:hAnsi="Calibri"/>
+          <w:b w:val="0"/>
+          <w:i w:val="0"/>
+          <w:color w:val="1A2138"/>
+          <w:sz w:val="21"/>
+        </w:rPr>
+        <w:t>limiti qui sopra.</w:t>
+      </w:r>
+    </w:p>
+    <w:p>
+      <w:pPr>
+        <w:pStyle w:val="Heading3"/>
+      </w:pPr>
+      <w:r>
+        <w:rPr>
+          <w:rFonts w:ascii="Calibri" w:hAnsi="Calibri"/>
+          <w:b w:val="0"/>
+          <w:i w:val="0"/>
+          <w:color w:val="A87200"/>
+          <w:sz w:val="23"/>
+        </w:rPr>
+        <w:t>Quattro cose che non faremo</w:t>
+      </w:r>
+    </w:p>
+    <w:p>
+      <w:pPr>
+        <w:pStyle w:val="ListBullet"/>
+        <w:spacing w:after="60"/>
+      </w:pPr>
+      <w:r>
+        <w:rPr>
+          <w:rFonts w:ascii="Calibri" w:hAnsi="Calibri"/>
+          <w:b/>
+          <w:i w:val="0"/>
+          <w:color w:val="1A2138"/>
+          <w:sz w:val="21"/>
+        </w:rPr>
+        <w:t>Nessun numero secco.</w:t>
+      </w:r>
+      <w:r>
+        <w:rPr>
+          <w:rFonts w:ascii="Calibri" w:hAnsi="Calibri"/>
+          <w:b w:val="0"/>
+          <w:i w:val="0"/>
+          <w:color w:val="1A2138"/>
+          <w:sz w:val="21"/>
+        </w:rPr>
+        <w:t xml:space="preserve"> Mai «produrrai 27,4 kg».</w:t>
+      </w:r>
+    </w:p>
+    <w:p>
+      <w:pPr>
+        <w:pStyle w:val="ListBullet"/>
+        <w:spacing w:after="60"/>
+      </w:pPr>
+      <w:r>
+        <w:rPr>
+          <w:rFonts w:ascii="Calibri" w:hAnsi="Calibri"/>
+          <w:b/>
+          <w:i w:val="0"/>
+          <w:color w:val="1A2138"/>
+          <w:sz w:val="21"/>
+        </w:rPr>
+        <w:t>Nessuna percentuale di accuratezza.</w:t>
+      </w:r>
+      <w:r>
+        <w:rPr>
+          <w:rFonts w:ascii="Calibri" w:hAnsi="Calibri"/>
+          <w:b w:val="0"/>
+          <w:i w:val="0"/>
+          <w:color w:val="1A2138"/>
+          <w:sz w:val="21"/>
+        </w:rPr>
+        <w:t xml:space="preserve"> «Accurato al 90 %» non significa nulla</w:t>
+      </w:r>
+    </w:p>
+    <w:p>
+      <w:pPr>
+        <w:jc w:val="both"/>
+      </w:pPr>
+      <w:r>
+        <w:rPr>
+          <w:rFonts w:ascii="Calibri" w:hAnsi="Calibri"/>
+          <w:b w:val="0"/>
+          <w:i w:val="0"/>
+          <w:color w:val="1A2138"/>
+          <w:sz w:val="21"/>
+        </w:rPr>
+        <w:t>in una regressione e induce una fiducia che il modello non merita.</w:t>
+      </w:r>
+    </w:p>
+    <w:p>
+      <w:pPr>
+        <w:pStyle w:val="ListBullet"/>
+        <w:spacing w:after="60"/>
+      </w:pPr>
+      <w:r>
+        <w:rPr>
+          <w:rFonts w:ascii="Calibri" w:hAnsi="Calibri"/>
+          <w:b/>
+          <w:i w:val="0"/>
+          <w:color w:val="1A2138"/>
+          <w:sz w:val="21"/>
+        </w:rPr>
+        <w:t>Nessun consiglio operativo derivato dalla previsione.</w:t>
+      </w:r>
+      <w:r>
+        <w:rPr>
+          <w:rFonts w:ascii="Calibri" w:hAnsi="Calibri"/>
+          <w:b w:val="0"/>
+          <w:i w:val="0"/>
+          <w:color w:val="1A2138"/>
+          <w:sz w:val="21"/>
+        </w:rPr>
+        <w:t xml:space="preserve"> Il modello non sa</w:t>
+      </w:r>
+    </w:p>
+    <w:p>
+      <w:pPr>
+        <w:jc w:val="both"/>
+      </w:pPr>
+      <w:r>
+        <w:rPr>
+          <w:rFonts w:ascii="Calibri" w:hAnsi="Calibri"/>
+          <w:b w:val="0"/>
+          <w:i w:val="0"/>
+          <w:color w:val="1A2138"/>
+          <w:sz w:val="21"/>
+        </w:rPr>
+        <w:t>niente del singolo alveare: non può dire quando smielare o se nutrire.</w:t>
+      </w:r>
+    </w:p>
+    <w:p>
+      <w:pPr>
+        <w:pStyle w:val="ListBullet"/>
+        <w:spacing w:after="60"/>
+      </w:pPr>
+      <w:r>
+        <w:rPr>
+          <w:rFonts w:ascii="Calibri" w:hAnsi="Calibri"/>
+          <w:b/>
+          <w:i w:val="0"/>
+          <w:color w:val="1A2138"/>
+          <w:sz w:val="21"/>
+        </w:rPr>
+        <w:t>Nessun arrotondamento sotto il chilo.</w:t>
+      </w:r>
+      <w:r>
+        <w:rPr>
+          <w:rFonts w:ascii="Calibri" w:hAnsi="Calibri"/>
+          <w:b w:val="0"/>
+          <w:i w:val="0"/>
+          <w:color w:val="1A2138"/>
+          <w:sz w:val="21"/>
+        </w:rPr>
+        <w:t xml:space="preserve"> I dati di partenza sono arrotondati</w:t>
+      </w:r>
+    </w:p>
+    <w:p>
+      <w:pPr>
+        <w:jc w:val="both"/>
+      </w:pPr>
+      <w:r>
+        <w:rPr>
+          <w:rFonts w:ascii="Calibri" w:hAnsi="Calibri"/>
+          <w:b w:val="0"/>
+          <w:i w:val="0"/>
+          <w:color w:val="1A2138"/>
+          <w:sz w:val="21"/>
+        </w:rPr>
+        <w:t xml:space="preserve">al migliaio di libbre (vedi </w:t>
+      </w:r>
+      <w:r>
+        <w:rPr>
+          <w:rFonts w:ascii="Calibri" w:hAnsi="Calibri"/>
+          <w:b w:val="0"/>
+          <w:i/>
+          <w:color w:val="1A2138"/>
+          <w:sz w:val="21"/>
+        </w:rPr>
+        <w:t>Dizionario · precisione</w:t>
+      </w:r>
+      <w:r>
+        <w:rPr>
+          <w:rFonts w:ascii="Calibri" w:hAnsi="Calibri"/>
+          <w:b w:val="0"/>
+          <w:i w:val="0"/>
+          <w:color w:val="1A2138"/>
+          <w:sz w:val="21"/>
+        </w:rPr>
+        <w:t>): tre decimali sarebbero una precisione inventata.</w:t>
+      </w:r>
+    </w:p>
+    <w:p>
+      <w:pPr>
+        <w:jc w:val="both"/>
+      </w:pPr>
+      <w:r>
+        <w:rPr>
+          <w:rFonts w:ascii="Calibri" w:hAnsi="Calibri"/>
+          <w:b w:val="0"/>
+          <w:i w:val="0"/>
+          <w:color w:val="1A2138"/>
+          <w:sz w:val="21"/>
+        </w:rPr>
+        <w:t xml:space="preserve">Queste quattro righe diventano requisiti di </w:t>
+      </w:r>
+      <w:r>
+        <w:rPr>
+          <w:rFonts w:ascii="Calibri" w:hAnsi="Calibri"/>
+          <w:b/>
+          <w:i w:val="0"/>
+          <w:color w:val="1A2138"/>
+          <w:sz w:val="21"/>
+        </w:rPr>
+        <w:t>M6-T5</w:t>
+      </w:r>
+      <w:r>
+        <w:rPr>
+          <w:rFonts w:ascii="Calibri" w:hAnsi="Calibri"/>
+          <w:b w:val="0"/>
+          <w:i w:val="0"/>
+          <w:color w:val="1A2138"/>
+          <w:sz w:val="21"/>
+        </w:rPr>
+        <w:t xml:space="preserve"> (pagina Previsioni) e </w:t>
+      </w:r>
+      <w:r>
+        <w:rPr>
+          <w:rFonts w:ascii="Calibri" w:hAnsi="Calibri"/>
+          <w:b/>
+          <w:i w:val="0"/>
+          <w:color w:val="1A2138"/>
+          <w:sz w:val="21"/>
+        </w:rPr>
+        <w:t>M6-T8</w:t>
+      </w:r>
+      <w:r>
+        <w:rPr>
+          <w:rFonts w:ascii="Calibri" w:hAnsi="Calibri"/>
+          <w:b w:val="0"/>
+          <w:i w:val="0"/>
+          <w:color w:val="1A2138"/>
+          <w:sz w:val="21"/>
+        </w:rPr>
+        <w:t xml:space="preserve"> (pagina Trasparenza).</w:t>
+      </w:r>
+    </w:p>
+    <w:p>
+      <w:pPr>
+        <w:spacing w:before="120" w:after="200"/>
+        <w:pBdr>
+          <w:bottom w:val="single" w:sz="6" w:space="6" w:color="D9D2C4"/>
+        </w:pBdr>
+      </w:pPr>
+    </w:p>
+    <w:p>
+      <w:pPr>
+        <w:pStyle w:val="Heading2"/>
+      </w:pPr>
+      <w:r>
+        <w:rPr>
+          <w:rFonts w:ascii="Calibri" w:hAnsi="Calibri"/>
+          <w:b w:val="0"/>
+          <w:i w:val="0"/>
+          <w:color w:val="1A2138"/>
+          <w:sz w:val="26"/>
+        </w:rPr>
+        <w:t>Cosa comporta per il resto del progetto</w:t>
+      </w:r>
+    </w:p>
+    <w:tbl>
+      <w:tblPr>
+        <w:tblW w:type="auto" w:w="0"/>
+        <w:jc w:val="left"/>
+        <w:tblLayout w:type="fixed"/>
+        <w:tblLook w:firstColumn="1" w:firstRow="1" w:lastColumn="0" w:lastRow="0" w:noHBand="0" w:noVBand="1" w:val="04A0"/>
+        <w:tblBorders>
+          <w:top w:val="single" w:sz="4" w:space="0" w:color="D9D2C4"/>
+          <w:left w:val="single" w:sz="4" w:space="0" w:color="D9D2C4"/>
+          <w:bottom w:val="single" w:sz="4" w:space="0" w:color="D9D2C4"/>
+          <w:right w:val="single" w:sz="4" w:space="0" w:color="D9D2C4"/>
+          <w:insideH w:val="single" w:sz="4" w:space="0" w:color="D9D2C4"/>
+          <w:insideV w:val="single" w:sz="4" w:space="0" w:color="D9D2C4"/>
+        </w:tblBorders>
+      </w:tblPr>
+      <w:tblGrid>
+        <w:gridCol w:w="4053"/>
+        <w:gridCol w:w="4559"/>
+      </w:tblGrid>
+      <w:tr>
+        <w:tc>
+          <w:tcPr>
+            <w:tcW w:type="dxa" w:w="4053"/>
+            <w:shd w:val="clear" w:fill="F5EFE1"/>
+          </w:tcPr>
+          <w:p>
+            <w:pPr>
+              <w:spacing w:after="40"/>
+            </w:pPr>
+            <w:r>
+              <w:rPr>
+                <w:rFonts w:ascii="Calibri" w:hAnsi="Calibri"/>
+                <w:b/>
+                <w:color w:val="1A2138"/>
+                <w:sz w:val="19"/>
+              </w:rPr>
               <w:t>Osservazione</w:t>
             </w:r>
           </w:p>
@@ -11088,7 +14477,7 @@
           <w:color w:val="1A2138"/>
           <w:sz w:val="21"/>
         </w:rPr>
-        <w:t>Deliberatamente fuori dallo scopo di M2-T1 e M2-T2:</w:t>
+        <w:t>Deliberatamente fuori dallo scopo di M2:</w:t>
       </w:r>
     </w:p>
     <w:p>
@@ -11104,7 +14493,7 @@
           <w:color w:val="1A2138"/>
           <w:sz w:val="21"/>
         </w:rPr>
-        <w:t xml:space="preserve">la </w:t>
+        <w:t xml:space="preserve">quali variabili entrano nel modello e come vengono codificate → </w:t>
       </w:r>
       <w:r>
         <w:rPr>
@@ -11114,42 +14503,7 @@
           <w:color w:val="1A2138"/>
           <w:sz w:val="21"/>
         </w:rPr>
-        <w:t>scelta formale del target</w:t>
-      </w:r>
-      <w:r>
-        <w:rPr>
-          <w:rFonts w:ascii="Calibri" w:hAnsi="Calibri"/>
-          <w:b w:val="0"/>
-          <w:i w:val="0"/>
-          <w:color w:val="1A2138"/>
-          <w:sz w:val="21"/>
-        </w:rPr>
-        <w:t xml:space="preserve"> della regressione e i limiti di</w:t>
-      </w:r>
-    </w:p>
-    <w:p>
-      <w:pPr>
-        <w:jc w:val="both"/>
-      </w:pPr>
-      <w:r>
-        <w:rPr>
-          <w:rFonts w:ascii="Calibri" w:hAnsi="Calibri"/>
-          <w:b w:val="0"/>
-          <w:i w:val="0"/>
-          <w:color w:val="1A2138"/>
-          <w:sz w:val="21"/>
-        </w:rPr>
-        <w:t xml:space="preserve">trasferibilità al caso italiano → </w:t>
-      </w:r>
-      <w:r>
-        <w:rPr>
-          <w:rFonts w:ascii="Calibri" w:hAnsi="Calibri"/>
-          <w:b/>
-          <w:i w:val="0"/>
-          <w:color w:val="1A2138"/>
-          <w:sz w:val="21"/>
-        </w:rPr>
-        <w:t>M2-T3</w:t>
+        <w:t>M4-T2</w:t>
       </w:r>
       <w:r>
         <w:rPr>
@@ -11175,7 +14529,7 @@
           <w:color w:val="1A2138"/>
           <w:sz w:val="21"/>
         </w:rPr>
-        <w:t xml:space="preserve">quali variabili entrano nel modello e come vengono codificate → </w:t>
+        <w:t xml:space="preserve">quale algoritmo si usa e come si valida → </w:t>
       </w:r>
       <w:r>
         <w:rPr>
@@ -11185,7 +14539,27 @@
           <w:color w:val="1A2138"/>
           <w:sz w:val="21"/>
         </w:rPr>
-        <w:t>M4-T2</w:t>
+        <w:t>M4-T3</w:t>
+      </w:r>
+      <w:r>
+        <w:rPr>
+          <w:rFonts w:ascii="Calibri" w:hAnsi="Calibri"/>
+          <w:b w:val="0"/>
+          <w:i w:val="0"/>
+          <w:color w:val="1A2138"/>
+          <w:sz w:val="21"/>
+        </w:rPr>
+        <w:t xml:space="preserve">, </w:t>
+      </w:r>
+      <w:r>
+        <w:rPr>
+          <w:rFonts w:ascii="Calibri" w:hAnsi="Calibri"/>
+          <w:b/>
+          <w:i w:val="0"/>
+          <w:color w:val="1A2138"/>
+          <w:sz w:val="21"/>
+        </w:rPr>
+        <w:t>M4-T5</w:t>
       </w:r>
       <w:r>
         <w:rPr>
@@ -11211,7 +14585,43 @@
           <w:color w:val="1A2138"/>
           <w:sz w:val="21"/>
         </w:rPr>
-        <w:t xml:space="preserve">come le tre tabelle si legano fra loro → </w:t>
+        <w:t xml:space="preserve">come si costruisce tecnicamente l'intervallo di previsione → </w:t>
+      </w:r>
+      <w:r>
+        <w:rPr>
+          <w:rFonts w:ascii="Calibri" w:hAnsi="Calibri"/>
+          <w:b/>
+          <w:i w:val="0"/>
+          <w:color w:val="1A2138"/>
+          <w:sz w:val="21"/>
+        </w:rPr>
+        <w:t>M4-T6</w:t>
+      </w:r>
+      <w:r>
+        <w:rPr>
+          <w:rFonts w:ascii="Calibri" w:hAnsi="Calibri"/>
+          <w:b w:val="0"/>
+          <w:i w:val="0"/>
+          <w:color w:val="1A2138"/>
+          <w:sz w:val="21"/>
+        </w:rPr>
+        <w:t>;</w:t>
+      </w:r>
+    </w:p>
+    <w:p>
+      <w:pPr>
+        <w:pStyle w:val="ListBullet"/>
+        <w:spacing w:after="60"/>
+      </w:pPr>
+      <w:r>
+        <w:rPr>
+          <w:rFonts w:ascii="Calibri" w:hAnsi="Calibri"/>
+          <w:b w:val="0"/>
+          <w:i w:val="0"/>
+          <w:color w:val="1A2138"/>
+          <w:sz w:val="21"/>
+        </w:rPr>
+        <w:t xml:space="preserve">come le tabelle si legano fra loro nello schema → </w:t>
       </w:r>
       <w:r>
         <w:rPr>
@@ -11265,14 +14675,14 @@
         </w:tblBorders>
       </w:tblPr>
       <w:tblGrid>
-        <w:gridCol w:w="1946"/>
-        <w:gridCol w:w="3179"/>
-        <w:gridCol w:w="3487"/>
+        <w:gridCol w:w="1795"/>
+        <w:gridCol w:w="3731"/>
+        <w:gridCol w:w="3086"/>
       </w:tblGrid>
       <w:tr>
         <w:tc>
           <w:tcPr>
-            <w:tcW w:type="dxa" w:w="1946"/>
+            <w:tcW w:type="dxa" w:w="1795"/>
             <w:shd w:val="clear" w:fill="F5EFE1"/>
           </w:tcPr>
           <w:p>
@@ -11292,7 +14702,7 @@
         </w:tc>
         <w:tc>
           <w:tcPr>
-            <w:tcW w:type="dxa" w:w="3179"/>
+            <w:tcW w:type="dxa" w:w="3731"/>
             <w:shd w:val="clear" w:fill="F5EFE1"/>
           </w:tcPr>
           <w:p>
@@ -11312,7 +14722,7 @@
         </w:tc>
         <w:tc>
           <w:tcPr>
-            <w:tcW w:type="dxa" w:w="3487"/>
+            <w:tcW w:type="dxa" w:w="3086"/>
             <w:shd w:val="clear" w:fill="F5EFE1"/>
           </w:tcPr>
           <w:p>
@@ -11334,7 +14744,7 @@
       <w:tr>
         <w:tc>
           <w:tcPr>
-            <w:tcW w:type="dxa" w:w="1946"/>
+            <w:tcW w:type="dxa" w:w="1795"/>
           </w:tcPr>
           <w:p>
             <w:pPr>
@@ -11354,7 +14764,7 @@
         </w:tc>
         <w:tc>
           <w:tcPr>
-            <w:tcW w:type="dxa" w:w="3179"/>
+            <w:tcW w:type="dxa" w:w="3731"/>
           </w:tcPr>
           <w:p>
             <w:pPr>
@@ -11374,7 +14784,7 @@
         </w:tc>
         <w:tc>
           <w:tcPr>
-            <w:tcW w:type="dxa" w:w="3487"/>
+            <w:tcW w:type="dxa" w:w="3086"/>
           </w:tcPr>
           <w:p>
             <w:pPr>
@@ -11396,7 +14806,7 @@
       <w:tr>
         <w:tc>
           <w:tcPr>
-            <w:tcW w:type="dxa" w:w="1946"/>
+            <w:tcW w:type="dxa" w:w="1795"/>
           </w:tcPr>
           <w:p>
             <w:pPr>
@@ -11416,7 +14826,7 @@
         </w:tc>
         <w:tc>
           <w:tcPr>
-            <w:tcW w:type="dxa" w:w="3179"/>
+            <w:tcW w:type="dxa" w:w="3731"/>
           </w:tcPr>
           <w:p>
             <w:pPr>
@@ -11436,7 +14846,7 @@
         </w:tc>
         <w:tc>
           <w:tcPr>
-            <w:tcW w:type="dxa" w:w="3487"/>
+            <w:tcW w:type="dxa" w:w="3086"/>
           </w:tcPr>
           <w:p>
             <w:pPr>
@@ -11458,7 +14868,7 @@
       <w:tr>
         <w:tc>
           <w:tcPr>
-            <w:tcW w:type="dxa" w:w="1946"/>
+            <w:tcW w:type="dxa" w:w="1795"/>
           </w:tcPr>
           <w:p>
             <w:pPr>
@@ -11478,7 +14888,7 @@
         </w:tc>
         <w:tc>
           <w:tcPr>
-            <w:tcW w:type="dxa" w:w="3179"/>
+            <w:tcW w:type="dxa" w:w="3731"/>
           </w:tcPr>
           <w:p>
             <w:pPr>
@@ -11498,7 +14908,7 @@
         </w:tc>
         <w:tc>
           <w:tcPr>
-            <w:tcW w:type="dxa" w:w="3487"/>
+            <w:tcW w:type="dxa" w:w="3086"/>
           </w:tcPr>
           <w:p>
             <w:pPr>
@@ -11520,7 +14930,7 @@
       <w:tr>
         <w:tc>
           <w:tcPr>
-            <w:tcW w:type="dxa" w:w="1946"/>
+            <w:tcW w:type="dxa" w:w="1795"/>
           </w:tcPr>
           <w:p>
             <w:pPr>
@@ -11540,7 +14950,7 @@
         </w:tc>
         <w:tc>
           <w:tcPr>
-            <w:tcW w:type="dxa" w:w="3179"/>
+            <w:tcW w:type="dxa" w:w="3731"/>
           </w:tcPr>
           <w:p>
             <w:pPr>
@@ -11560,7 +14970,7 @@
         </w:tc>
         <w:tc>
           <w:tcPr>
-            <w:tcW w:type="dxa" w:w="3487"/>
+            <w:tcW w:type="dxa" w:w="3086"/>
           </w:tcPr>
           <w:p>
             <w:pPr>
@@ -11582,7 +14992,7 @@
       <w:tr>
         <w:tc>
           <w:tcPr>
-            <w:tcW w:type="dxa" w:w="1946"/>
+            <w:tcW w:type="dxa" w:w="1795"/>
           </w:tcPr>
           <w:p>
             <w:pPr>
@@ -11602,7 +15012,7 @@
         </w:tc>
         <w:tc>
           <w:tcPr>
-            <w:tcW w:type="dxa" w:w="3179"/>
+            <w:tcW w:type="dxa" w:w="3731"/>
           </w:tcPr>
           <w:p>
             <w:pPr>
@@ -11622,7 +15032,7 @@
         </w:tc>
         <w:tc>
           <w:tcPr>
-            <w:tcW w:type="dxa" w:w="3487"/>
+            <w:tcW w:type="dxa" w:w="3086"/>
           </w:tcPr>
           <w:p>
             <w:pPr>
@@ -11644,7 +15054,7 @@
       <w:tr>
         <w:tc>
           <w:tcPr>
-            <w:tcW w:type="dxa" w:w="1946"/>
+            <w:tcW w:type="dxa" w:w="1795"/>
           </w:tcPr>
           <w:p>
             <w:pPr>
@@ -11664,7 +15074,7 @@
         </w:tc>
         <w:tc>
           <w:tcPr>
-            <w:tcW w:type="dxa" w:w="3179"/>
+            <w:tcW w:type="dxa" w:w="3731"/>
           </w:tcPr>
           <w:p>
             <w:pPr>
@@ -11684,7 +15094,7 @@
         </w:tc>
         <w:tc>
           <w:tcPr>
-            <w:tcW w:type="dxa" w:w="3487"/>
+            <w:tcW w:type="dxa" w:w="3086"/>
           </w:tcPr>
           <w:p>
             <w:pPr>
@@ -11706,7 +15116,7 @@
       <w:tr>
         <w:tc>
           <w:tcPr>
-            <w:tcW w:type="dxa" w:w="1946"/>
+            <w:tcW w:type="dxa" w:w="1795"/>
           </w:tcPr>
           <w:p>
             <w:pPr>
@@ -11726,7 +15136,7 @@
         </w:tc>
         <w:tc>
           <w:tcPr>
-            <w:tcW w:type="dxa" w:w="3179"/>
+            <w:tcW w:type="dxa" w:w="3731"/>
           </w:tcPr>
           <w:p>
             <w:pPr>
@@ -11756,7 +15166,7 @@
         </w:tc>
         <w:tc>
           <w:tcPr>
-            <w:tcW w:type="dxa" w:w="3487"/>
+            <w:tcW w:type="dxa" w:w="3086"/>
           </w:tcPr>
           <w:p>
             <w:pPr>
@@ -11778,7 +15188,7 @@
       <w:tr>
         <w:tc>
           <w:tcPr>
-            <w:tcW w:type="dxa" w:w="1946"/>
+            <w:tcW w:type="dxa" w:w="1795"/>
           </w:tcPr>
           <w:p>
             <w:pPr>
@@ -11798,7 +15208,7 @@
         </w:tc>
         <w:tc>
           <w:tcPr>
-            <w:tcW w:type="dxa" w:w="3179"/>
+            <w:tcW w:type="dxa" w:w="3731"/>
           </w:tcPr>
           <w:p>
             <w:pPr>
@@ -11828,7 +15238,7 @@
         </w:tc>
         <w:tc>
           <w:tcPr>
-            <w:tcW w:type="dxa" w:w="3487"/>
+            <w:tcW w:type="dxa" w:w="3086"/>
           </w:tcPr>
           <w:p>
             <w:pPr>
@@ -11850,7 +15260,7 @@
       <w:tr>
         <w:tc>
           <w:tcPr>
-            <w:tcW w:type="dxa" w:w="1946"/>
+            <w:tcW w:type="dxa" w:w="1795"/>
           </w:tcPr>
           <w:p>
             <w:pPr>
@@ -11870,7 +15280,7 @@
         </w:tc>
         <w:tc>
           <w:tcPr>
-            <w:tcW w:type="dxa" w:w="3179"/>
+            <w:tcW w:type="dxa" w:w="3731"/>
           </w:tcPr>
           <w:p>
             <w:pPr>
@@ -11930,7 +15340,7 @@
         </w:tc>
         <w:tc>
           <w:tcPr>
-            <w:tcW w:type="dxa" w:w="3487"/>
+            <w:tcW w:type="dxa" w:w="3086"/>
           </w:tcPr>
           <w:p>
             <w:pPr>
@@ -11952,7 +15362,7 @@
       <w:tr>
         <w:tc>
           <w:tcPr>
-            <w:tcW w:type="dxa" w:w="1946"/>
+            <w:tcW w:type="dxa" w:w="1795"/>
           </w:tcPr>
           <w:p>
             <w:pPr>
@@ -11972,7 +15382,7 @@
         </w:tc>
         <w:tc>
           <w:tcPr>
-            <w:tcW w:type="dxa" w:w="3179"/>
+            <w:tcW w:type="dxa" w:w="3731"/>
           </w:tcPr>
           <w:p>
             <w:pPr>
@@ -11992,7 +15402,7 @@
         </w:tc>
         <w:tc>
           <w:tcPr>
-            <w:tcW w:type="dxa" w:w="3487"/>
+            <w:tcW w:type="dxa" w:w="3086"/>
           </w:tcPr>
           <w:p>
             <w:pPr>
@@ -12014,7 +15424,7 @@
       <w:tr>
         <w:tc>
           <w:tcPr>
-            <w:tcW w:type="dxa" w:w="1946"/>
+            <w:tcW w:type="dxa" w:w="1795"/>
           </w:tcPr>
           <w:p>
             <w:pPr>
@@ -12034,7 +15444,7 @@
         </w:tc>
         <w:tc>
           <w:tcPr>
-            <w:tcW w:type="dxa" w:w="3179"/>
+            <w:tcW w:type="dxa" w:w="3731"/>
           </w:tcPr>
           <w:p>
             <w:pPr>
@@ -12054,7 +15464,7 @@
         </w:tc>
         <w:tc>
           <w:tcPr>
-            <w:tcW w:type="dxa" w:w="3487"/>
+            <w:tcW w:type="dxa" w:w="3086"/>
           </w:tcPr>
           <w:p>
             <w:pPr>
@@ -12076,7 +15486,7 @@
       <w:tr>
         <w:tc>
           <w:tcPr>
-            <w:tcW w:type="dxa" w:w="1946"/>
+            <w:tcW w:type="dxa" w:w="1795"/>
           </w:tcPr>
           <w:p>
             <w:pPr>
@@ -12096,7 +15506,7 @@
         </w:tc>
         <w:tc>
           <w:tcPr>
-            <w:tcW w:type="dxa" w:w="3179"/>
+            <w:tcW w:type="dxa" w:w="3731"/>
           </w:tcPr>
           <w:p>
             <w:pPr>
@@ -12116,7 +15526,7 @@
         </w:tc>
         <w:tc>
           <w:tcPr>
-            <w:tcW w:type="dxa" w:w="3487"/>
+            <w:tcW w:type="dxa" w:w="3086"/>
           </w:tcPr>
           <w:p>
             <w:pPr>
@@ -12131,6 +15541,264 @@
                 <w:sz w:val="19"/>
               </w:rPr>
               <w:t>Tipi corretti fin dalla lettura</w:t>
+            </w:r>
+          </w:p>
+        </w:tc>
+      </w:tr>
+      <w:tr>
+        <w:tc>
+          <w:tcPr>
+            <w:tcW w:type="dxa" w:w="1795"/>
+          </w:tcPr>
+          <w:p>
+            <w:pPr>
+              <w:spacing w:after="40"/>
+            </w:pPr>
+            <w:r>
+              <w:rPr>
+                <w:rFonts w:ascii="Calibri" w:hAnsi="Calibri"/>
+                <w:b w:val="0"/>
+                <w:i w:val="0"/>
+                <w:color w:val="1A2138"/>
+                <w:sz w:val="19"/>
+              </w:rPr>
+              <w:t>T1</w:t>
+            </w:r>
+          </w:p>
+        </w:tc>
+        <w:tc>
+          <w:tcPr>
+            <w:tcW w:type="dxa" w:w="3731"/>
+          </w:tcPr>
+          <w:p>
+            <w:pPr>
+              <w:spacing w:after="40"/>
+            </w:pPr>
+            <w:r>
+              <w:rPr>
+                <w:rFonts w:ascii="Calibri" w:hAnsi="Calibri"/>
+                <w:b w:val="0"/>
+                <w:i w:val="0"/>
+                <w:color w:val="1A2138"/>
+                <w:sz w:val="19"/>
+              </w:rPr>
+              <w:t xml:space="preserve">Target: </w:t>
+            </w:r>
+            <w:r>
+              <w:rPr>
+                <w:rFonts w:ascii="Consolas" w:hAnsi="Consolas"/>
+                <w:b w:val="0"/>
+                <w:i w:val="0"/>
+                <w:color w:val="7A5200"/>
+                <w:sz w:val="18"/>
+              </w:rPr>
+              <w:t>resa_per_colonia_kg</w:t>
+            </w:r>
+          </w:p>
+        </w:tc>
+        <w:tc>
+          <w:tcPr>
+            <w:tcW w:type="dxa" w:w="3086"/>
+          </w:tcPr>
+          <w:p>
+            <w:pPr>
+              <w:spacing w:after="40"/>
+            </w:pPr>
+            <w:r>
+              <w:rPr>
+                <w:rFonts w:ascii="Calibri" w:hAnsi="Calibri"/>
+                <w:b w:val="0"/>
+                <w:i w:val="0"/>
+                <w:color w:val="1A2138"/>
+                <w:sz w:val="19"/>
+              </w:rPr>
+              <w:t>Unica grandezza biologica e indipendente dalla scala</w:t>
+            </w:r>
+          </w:p>
+        </w:tc>
+      </w:tr>
+      <w:tr>
+        <w:tc>
+          <w:tcPr>
+            <w:tcW w:type="dxa" w:w="1795"/>
+          </w:tcPr>
+          <w:p>
+            <w:pPr>
+              <w:spacing w:after="40"/>
+            </w:pPr>
+            <w:r>
+              <w:rPr>
+                <w:rFonts w:ascii="Calibri" w:hAnsi="Calibri"/>
+                <w:b w:val="0"/>
+                <w:i w:val="0"/>
+                <w:color w:val="1A2138"/>
+                <w:sz w:val="19"/>
+              </w:rPr>
+              <w:t>T2</w:t>
+            </w:r>
+          </w:p>
+        </w:tc>
+        <w:tc>
+          <w:tcPr>
+            <w:tcW w:type="dxa" w:w="3731"/>
+          </w:tcPr>
+          <w:p>
+            <w:pPr>
+              <w:spacing w:after="40"/>
+            </w:pPr>
+            <w:r>
+              <w:rPr>
+                <w:rFonts w:ascii="Calibri" w:hAnsi="Calibri"/>
+                <w:b w:val="0"/>
+                <w:i w:val="0"/>
+                <w:color w:val="1A2138"/>
+                <w:sz w:val="19"/>
+              </w:rPr>
+              <w:t>Soglia di accettazione per M4: MAE &lt; 4,25 kg</w:t>
+            </w:r>
+          </w:p>
+        </w:tc>
+        <w:tc>
+          <w:tcPr>
+            <w:tcW w:type="dxa" w:w="3086"/>
+          </w:tcPr>
+          <w:p>
+            <w:pPr>
+              <w:spacing w:after="40"/>
+            </w:pPr>
+            <w:r>
+              <w:rPr>
+                <w:rFonts w:ascii="Calibri" w:hAnsi="Calibri"/>
+                <w:b w:val="0"/>
+                <w:i w:val="0"/>
+                <w:color w:val="1A2138"/>
+                <w:sz w:val="19"/>
+              </w:rPr>
+              <w:t>Sotto quel valore bastano due medie e una retta</w:t>
+            </w:r>
+          </w:p>
+        </w:tc>
+      </w:tr>
+      <w:tr>
+        <w:tc>
+          <w:tcPr>
+            <w:tcW w:type="dxa" w:w="1795"/>
+          </w:tcPr>
+          <w:p>
+            <w:pPr>
+              <w:spacing w:after="40"/>
+            </w:pPr>
+            <w:r>
+              <w:rPr>
+                <w:rFonts w:ascii="Calibri" w:hAnsi="Calibri"/>
+                <w:b w:val="0"/>
+                <w:i w:val="0"/>
+                <w:color w:val="1A2138"/>
+                <w:sz w:val="19"/>
+              </w:rPr>
+              <w:t>T3</w:t>
+            </w:r>
+          </w:p>
+        </w:tc>
+        <w:tc>
+          <w:tcPr>
+            <w:tcW w:type="dxa" w:w="3731"/>
+          </w:tcPr>
+          <w:p>
+            <w:pPr>
+              <w:spacing w:after="40"/>
+            </w:pPr>
+            <w:r>
+              <w:rPr>
+                <w:rFonts w:ascii="Calibri" w:hAnsi="Calibri"/>
+                <w:b w:val="0"/>
+                <w:i w:val="0"/>
+                <w:color w:val="1A2138"/>
+                <w:sz w:val="19"/>
+              </w:rPr>
+              <w:t>La previsione si mostra come intervallo, mai come numero</w:t>
+            </w:r>
+          </w:p>
+        </w:tc>
+        <w:tc>
+          <w:tcPr>
+            <w:tcW w:type="dxa" w:w="3086"/>
+          </w:tcPr>
+          <w:p>
+            <w:pPr>
+              <w:spacing w:after="40"/>
+            </w:pPr>
+            <w:r>
+              <w:rPr>
+                <w:rFonts w:ascii="Calibri" w:hAnsi="Calibri"/>
+                <w:b w:val="0"/>
+                <w:i w:val="0"/>
+                <w:color w:val="1A2138"/>
+                <w:sz w:val="19"/>
+              </w:rPr>
+              <w:t>L'80 % dei casi reali sta fra 18 e 40 kg</w:t>
+            </w:r>
+          </w:p>
+        </w:tc>
+      </w:tr>
+      <w:tr>
+        <w:tc>
+          <w:tcPr>
+            <w:tcW w:type="dxa" w:w="1795"/>
+          </w:tcPr>
+          <w:p>
+            <w:pPr>
+              <w:spacing w:after="40"/>
+            </w:pPr>
+            <w:r>
+              <w:rPr>
+                <w:rFonts w:ascii="Calibri" w:hAnsi="Calibri"/>
+                <w:b w:val="0"/>
+                <w:i w:val="0"/>
+                <w:color w:val="1A2138"/>
+                <w:sz w:val="19"/>
+              </w:rPr>
+              <w:t>T4</w:t>
+            </w:r>
+          </w:p>
+        </w:tc>
+        <w:tc>
+          <w:tcPr>
+            <w:tcW w:type="dxa" w:w="3731"/>
+          </w:tcPr>
+          <w:p>
+            <w:pPr>
+              <w:spacing w:after="40"/>
+            </w:pPr>
+            <w:r>
+              <w:rPr>
+                <w:rFonts w:ascii="Calibri" w:hAnsi="Calibri"/>
+                <w:b w:val="0"/>
+                <w:i w:val="0"/>
+                <w:color w:val="1A2138"/>
+                <w:sz w:val="19"/>
+              </w:rPr>
+              <w:t>Nessuna percentuale di accuratezza in interfaccia</w:t>
+            </w:r>
+          </w:p>
+        </w:tc>
+        <w:tc>
+          <w:tcPr>
+            <w:tcW w:type="dxa" w:w="3086"/>
+          </w:tcPr>
+          <w:p>
+            <w:pPr>
+              <w:spacing w:after="40"/>
+            </w:pPr>
+            <w:r>
+              <w:rPr>
+                <w:rFonts w:ascii="Calibri" w:hAnsi="Calibri"/>
+                <w:b w:val="0"/>
+                <w:i w:val="0"/>
+                <w:color w:val="1A2138"/>
+                <w:sz w:val="19"/>
+              </w:rPr>
+              <w:t>Non significa nulla in una regressione</w:t>
             </w:r>
           </w:p>
         </w:tc>

</xml_diff>